<commit_message>
Deutsch 7A: Futur-Stunde mit Rückbau ins Perfekt
Schülersätze zum Wochenende an der Tafel markieren und per Kreide-Kette
in einer zweiten Spalte ins Perfekt umbauen (Idee der Lehrkraft). Die
Klammer bleibt, beide Teile werden ausgetauscht. Reflexionslog ergänzt.

Co-Authored-By: Claude Opus 5.5 <noreply@anthropic.com>
Claude-Session: https://claude.ai/code/session_01KXvLXHMYPnCyEbMRgNaaYs
</commit_message>
<xml_diff>
--- a/Deutsch_7A/Futur_I/Tafelskript_Futur_I.docx
+++ b/Deutsch_7A/Futur_I/Tafelskript_Futur_I.docx
@@ -121,7 +121,7 @@
           <w:sz w:val="21"/>
           <w:szCs w:val="21"/>
         </w:rPr>
-        <w:t xml:space="preserve">Die Klasse bildet das Futur I (werden + Infinitiv), konjugiert werden sicher und schreibt eigene Sätze über ihr Wochenende im Futur I.</w:t>
+        <w:t xml:space="preserve">Die Klasse bildet das Futur I (werden + Infinitiv), konjugiert werden sicher, schreibt eigene Sätze über ihr Wochenende im Futur I und baut sie ins Perfekt um. Dabei wird sichtbar: Die Klammer bleibt, nur beide Teile werden ausgetauscht.</w:t>
       </w:r>
     </w:p>
     <w:p>
@@ -307,7 +307,7 @@
                 <w:sz w:val="21"/>
                 <w:szCs w:val="21"/>
               </w:rPr>
-              <w:t xml:space="preserve">8′</w:t>
+              <w:t xml:space="preserve">7′</w:t>
             </w:r>
           </w:p>
         </w:tc>
@@ -415,7 +415,7 @@
                 <w:sz w:val="21"/>
                 <w:szCs w:val="21"/>
               </w:rPr>
-              <w:t xml:space="preserve">12′</w:t>
+              <w:t xml:space="preserve">10′</w:t>
             </w:r>
           </w:p>
         </w:tc>
@@ -483,7 +483,7 @@
                 <w:sz w:val="21"/>
                 <w:szCs w:val="21"/>
               </w:rPr>
-              <w:t xml:space="preserve">Wochenend-Sätze an der Tafel, werden konjugieren, Klammer zeichnen</w:t>
+              <w:t xml:space="preserve">vier Beispielsätze, werden konjugieren, Klammer zeichnen</w:t>
             </w:r>
           </w:p>
         </w:tc>
@@ -631,7 +631,7 @@
                 <w:sz w:val="21"/>
                 <w:szCs w:val="21"/>
               </w:rPr>
-              <w:t xml:space="preserve">13′</w:t>
+              <w:t xml:space="preserve">6′</w:t>
             </w:r>
           </w:p>
         </w:tc>
@@ -665,7 +665,7 @@
                 <w:sz w:val="21"/>
                 <w:szCs w:val="21"/>
               </w:rPr>
-              <w:t xml:space="preserve">3 Ü7 Mein Wochenende</w:t>
+              <w:t xml:space="preserve">3 Ü7 a Mein Wochenende</w:t>
             </w:r>
           </w:p>
         </w:tc>
@@ -699,7 +699,7 @@
                 <w:sz w:val="21"/>
                 <w:szCs w:val="21"/>
               </w:rPr>
-              <w:t xml:space="preserve">fünf eigene Sätze im Futur I schreiben</w:t>
+              <w:t xml:space="preserve">drei eigene Sätze im Futur I schreiben</w:t>
             </w:r>
           </w:p>
         </w:tc>
@@ -739,7 +739,7 @@
                 <w:sz w:val="21"/>
                 <w:szCs w:val="21"/>
               </w:rPr>
-              <w:t xml:space="preserve">8′</w:t>
+              <w:t xml:space="preserve">7′</w:t>
             </w:r>
           </w:p>
         </w:tc>
@@ -773,7 +773,7 @@
                 <w:sz w:val="21"/>
                 <w:szCs w:val="21"/>
               </w:rPr>
-              <w:t xml:space="preserve">4 Vergleich</w:t>
+              <w:t xml:space="preserve">4 Sätze an die Tafel</w:t>
             </w:r>
           </w:p>
         </w:tc>
@@ -807,7 +807,7 @@
                 <w:sz w:val="21"/>
                 <w:szCs w:val="21"/>
               </w:rPr>
-              <w:t xml:space="preserve">Kreide-Kette: je ein Satz an die Tafel, alle prüfen mit</w:t>
+              <w:t xml:space="preserve">Lehrkraft schreibt Schülersätze an, Kreide-Kette markiert werden und Infinitiv</w:t>
             </w:r>
           </w:p>
         </w:tc>
@@ -847,7 +847,7 @@
                 <w:sz w:val="21"/>
                 <w:szCs w:val="21"/>
               </w:rPr>
-              <w:t xml:space="preserve">(3′)</w:t>
+              <w:t xml:space="preserve">10′</w:t>
             </w:r>
           </w:p>
         </w:tc>
@@ -881,7 +881,7 @@
                 <w:sz w:val="21"/>
                 <w:szCs w:val="21"/>
               </w:rPr>
-              <w:t xml:space="preserve">5 optional</w:t>
+              <w:t xml:space="preserve">5 Ü7 b Zurück ins Perfekt</w:t>
             </w:r>
           </w:p>
         </w:tc>
@@ -915,7 +915,7 @@
                 <w:sz w:val="21"/>
                 <w:szCs w:val="21"/>
               </w:rPr>
-              <w:t xml:space="preserve">Perfekt oder Futur I? – nur, wenn Zeit bleibt</w:t>
+              <w:t xml:space="preserve">„Ich frage euch nächste Woche …“ – Sätze per Kreide-Kette ins Perfekt umbauen</w:t>
             </w:r>
           </w:p>
         </w:tc>
@@ -1209,7 +1209,7 @@
                 <w:sz w:val="20"/>
                 <w:szCs w:val="20"/>
               </w:rPr>
-              <w:t xml:space="preserve">Ü7</w:t>
+              <w:t xml:space="preserve">Ü7 a</w:t>
             </w:r>
           </w:p>
         </w:tc>
@@ -1241,7 +1241,80 @@
                 <w:sz w:val="20"/>
                 <w:szCs w:val="20"/>
               </w:rPr>
-              <w:t xml:space="preserve">fünf eigene Sätze zum Wochenende, werden rot, Infinitiv blau, Klammer</w:t>
+              <w:t xml:space="preserve">drei eigene Sätze zum Wochenende im Futur I, werden rot, Infinitiv blau, Klammer</w:t>
+            </w:r>
+          </w:p>
+        </w:tc>
+      </w:tr>
+      <w:tr>
+        <w:trPr>
+          <w:cantSplit/>
+          <w:trHeight w:val="360" w:hRule="atLeast"/>
+        </w:trPr>
+        <w:tc>
+          <w:tcPr>
+            <w:tcW w:type="dxa" w:w="2300"/>
+            <w:tcBorders>
+              <w:top w:val="single" w:color="B9C6E8" w:sz="6"/>
+              <w:left w:val="single" w:color="B9C6E8" w:sz="6"/>
+              <w:bottom w:val="single" w:color="B9C6E8" w:sz="6"/>
+              <w:right w:val="single" w:color="B9C6E8" w:sz="6"/>
+            </w:tcBorders>
+            <w:shd w:fill="F4F7FD" w:color="auto" w:val="clear"/>
+            <w:tcMar>
+              <w:top w:type="dxa" w:w="60"/>
+              <w:left w:type="dxa" w:w="100"/>
+              <w:bottom w:type="dxa" w:w="60"/>
+              <w:right w:type="dxa" w:w="100"/>
+            </w:tcMar>
+            <w:vAlign w:val="center"/>
+          </w:tcPr>
+          <w:p>
+            <w:pPr>
+              <w:spacing w:after="0" w:before="0"/>
+            </w:pPr>
+            <w:r>
+              <w:rPr>
+                <w:rFonts w:ascii="Calibri" w:cs="Calibri" w:eastAsia="Calibri" w:hAnsi="Calibri"/>
+                <w:b/>
+                <w:bCs/>
+                <w:color w:val="C77C12"/>
+                <w:sz w:val="20"/>
+                <w:szCs w:val="20"/>
+              </w:rPr>
+              <w:t xml:space="preserve">Ü7 b</w:t>
+            </w:r>
+          </w:p>
+        </w:tc>
+        <w:tc>
+          <w:tcPr>
+            <w:tcW w:type="dxa" w:w="7906"/>
+            <w:tcBorders>
+              <w:top w:val="single" w:color="B9C6E8" w:sz="6"/>
+              <w:left w:val="single" w:color="B9C6E8" w:sz="6"/>
+              <w:bottom w:val="single" w:color="B9C6E8" w:sz="6"/>
+              <w:right w:val="single" w:color="B9C6E8" w:sz="6"/>
+            </w:tcBorders>
+            <w:tcMar>
+              <w:top w:type="dxa" w:w="60"/>
+              <w:left w:type="dxa" w:w="100"/>
+              <w:bottom w:type="dxa" w:w="60"/>
+              <w:right w:type="dxa" w:w="100"/>
+            </w:tcMar>
+            <w:vAlign w:val="center"/>
+          </w:tcPr>
+          <w:p>
+            <w:pPr>
+              <w:spacing w:after="0" w:before="0"/>
+            </w:pPr>
+            <w:r>
+              <w:rPr>
+                <w:rFonts w:ascii="Calibri" w:cs="Calibri" w:eastAsia="Calibri" w:hAnsi="Calibri"/>
+                <w:color w:val="000000"/>
+                <w:sz w:val="20"/>
+                <w:szCs w:val="20"/>
+              </w:rPr>
+              <w:t xml:space="preserve">die Tafelsätze in zwei Spalten: Futur I | Perfekt (mitgeschrieben)</w:t>
             </w:r>
           </w:p>
         </w:tc>
@@ -1450,7 +1523,7 @@
           <w:sz w:val="20"/>
           <w:szCs w:val="20"/>
         </w:rPr>
-        <w:t xml:space="preserve">   8 Min.</w:t>
+        <w:t xml:space="preserve">   7 Min.</w:t>
       </w:r>
     </w:p>
     <w:tbl>
@@ -2050,7 +2123,7 @@
                       <w:sz w:val="19"/>
                       <w:szCs w:val="19"/>
                     </w:rPr>
-                    <w:t xml:space="preserve">8 Minuten · Kreide-Kette, alle schreiben mit</w:t>
+                    <w:t xml:space="preserve">7 Minuten · Kreide-Kette, alle schreiben mit</w:t>
                   </w:r>
                   <w:r>
                     <w:rPr>
@@ -2159,7 +2232,7 @@
           <w:sz w:val="20"/>
           <w:szCs w:val="20"/>
         </w:rPr>
-        <w:t xml:space="preserve">   12 Min.</w:t>
+        <w:t xml:space="preserve">   10 Min.</w:t>
       </w:r>
     </w:p>
     <w:tbl>
@@ -3193,20 +3266,6 @@
                 <w:szCs w:val="21"/>
               </w:rPr>
               <w:t xml:space="preserve">Satz 4 ist eine Frage: Dort steht werden vorne – die Klammer bleibt trotzdem.</w:t>
-            </w:r>
-          </w:p>
-          <w:p>
-            <w:pPr>
-              <w:spacing w:after="50" w:before="0"/>
-            </w:pPr>
-            <w:r>
-              <w:rPr>
-                <w:rFonts w:ascii="Calibri" w:cs="Calibri" w:eastAsia="Calibri" w:hAnsi="Calibri"/>
-                <w:color w:val="000000"/>
-                <w:sz w:val="21"/>
-                <w:szCs w:val="21"/>
-              </w:rPr>
-              <w:t xml:space="preserve">Kontrast an der Tafel daneben: Ich habe Fußball gespielt (Vergangenheit) – Ich werde Fußball spielen (Zukunft).</w:t>
             </w:r>
           </w:p>
         </w:tc>
@@ -4873,7 +4932,7 @@
           <w:sz w:val="28"/>
           <w:szCs w:val="28"/>
         </w:rPr>
-        <w:t xml:space="preserve">Ü7 Mein Wochenende</w:t>
+        <w:t xml:space="preserve">Ü7 a Mein Wochenende</w:t>
       </w:r>
       <w:r>
         <w:rPr>
@@ -4884,7 +4943,7 @@
           <w:sz w:val="20"/>
           <w:szCs w:val="20"/>
         </w:rPr>
-        <w:t xml:space="preserve">   13 Min.</w:t>
+        <w:t xml:space="preserve">   6 Min.</w:t>
       </w:r>
     </w:p>
     <w:tbl>
@@ -4997,7 +5056,7 @@
                 <w:sz w:val="21"/>
                 <w:szCs w:val="21"/>
               </w:rPr>
-              <w:t xml:space="preserve">„Jetzt arbeitet ihr allein. Die Aufgabe steht rechts an der Tafel: Ü7. Ihr schreibt fünf eigene Sätze darüber, was ihr am Wochenende machen werdet. Acht Minuten. Wer fertig ist: Stift hinlegen.“</w:t>
+              <w:t xml:space="preserve">„Jetzt arbeitet ihr allein. Die Aufgabe steht rechts an der Tafel: Ü7 a. Schreibt drei Sätze darüber, was ihr am Wochenende machen werdet. Fünf Minuten. Wer fertig ist: Stift hinlegen.“</w:t>
             </w:r>
           </w:p>
           <w:p>
@@ -5011,7 +5070,7 @@
                 <w:sz w:val="21"/>
                 <w:szCs w:val="21"/>
               </w:rPr>
-              <w:t xml:space="preserve">Herumgehen und auf typische Fehler achten: „Ich werde spiele“ (finite Form statt Infinitiv), „du wirdst“ / „er werdet“ (falsche werden-Form), Infinitiv nicht am Satzende („Ich werde spielen am Samstag“).</w:t>
+              <w:t xml:space="preserve">Herumgehen und auf typische Fehler achten: „Ich werde spiele“ (finite Form statt Infinitiv), „du wirdst“ / „er werdet“, Infinitiv nicht am Satzende.</w:t>
             </w:r>
           </w:p>
           <w:p>
@@ -5025,7 +5084,7 @@
                 <w:sz w:val="21"/>
                 <w:szCs w:val="21"/>
               </w:rPr>
-              <w:t xml:space="preserve">Wer schnell fertig ist: die ★-Aufgabe oder einen sechsten Satz mit einer Frage („Wirst du …?“).</w:t>
+              <w:t xml:space="preserve">Dabei schon passende Sätze für Phase 4 auswählen: möglichst einige mit Bewegungsverben (gehen, fahren) und einige ohne (zocken, schauen) – das macht den Perfekt-Umbau später ergiebig.</w:t>
             </w:r>
           </w:p>
           <w:tbl>
@@ -5078,7 +5137,7 @@
                       <w:sz w:val="16"/>
                       <w:szCs w:val="16"/>
                     </w:rPr>
-                    <w:t xml:space="preserve">TAFEL · rechts · Ü7 Mein Wochenende</w:t>
+                    <w:t xml:space="preserve">TAFEL · rechts · Ü7 a Mein Wochenende</w:t>
                   </w:r>
                 </w:p>
               </w:tc>
@@ -5129,7 +5188,7 @@
                       <w:sz w:val="21"/>
                       <w:szCs w:val="21"/>
                     </w:rPr>
-                    <w:t xml:space="preserve">Schreibe Ü7 an den Rand.</w:t>
+                    <w:t xml:space="preserve">Schreibe Ü7 a an den Rand.</w:t>
                   </w:r>
                 </w:p>
                 <w:p>
@@ -5156,7 +5215,7 @@
                       <w:sz w:val="21"/>
                       <w:szCs w:val="21"/>
                     </w:rPr>
-                    <w:t xml:space="preserve">Schreibe fünf Sätze: Was wirst du am Wochenende machen? Benutze in jedem Satz das Futur I.</w:t>
+                    <w:t xml:space="preserve">Schreibe drei Sätze: Was wirst du am Wochenende machen? Benutze in jedem Satz das Futur I.</w:t>
                   </w:r>
                 </w:p>
                 <w:p>
@@ -5183,7 +5242,7 @@
                       <w:sz w:val="21"/>
                       <w:szCs w:val="21"/>
                     </w:rPr>
-                    <w:t xml:space="preserve">Markiere werden rot und den Infinitiv blau. Zeichne die Klammer.</w:t>
+                    <w:t xml:space="preserve">Markiere werden rot und den Infinitiv blau.</w:t>
                   </w:r>
                 </w:p>
                 <w:p>
@@ -5210,7 +5269,7 @@
                       <w:sz w:val="21"/>
                       <w:szCs w:val="21"/>
                     </w:rPr>
-                    <w:t xml:space="preserve">★ Beginne nicht jeden Satz mit „Ich“ – z. B. „Am Samstag …“, „Danach …“, „Mit meiner Familie …“.</w:t>
+                    <w:t xml:space="preserve">★ Beginne nicht jeden Satz mit „Ich“ – z. B. „Am Samstag …“, „Danach …“.</w:t>
                   </w:r>
                 </w:p>
                 <w:p>
@@ -5249,7 +5308,7 @@
                       <w:sz w:val="20"/>
                       <w:szCs w:val="20"/>
                     </w:rPr>
-                    <w:t xml:space="preserve">ausschlafen · zocken · trainieren · Freunde treffen · ins Kino gehen · eine Serie schauen · Oma besuchen · Hausaufgaben machen · shoppen gehen</w:t>
+                    <w:t xml:space="preserve">ausschlafen · zocken · trainieren · Freunde treffen · ins Kino gehen · eine Serie schauen · Oma besuchen · Hausaufgaben machen · Rad fahren</w:t>
                   </w:r>
                 </w:p>
                 <w:p>
@@ -5288,7 +5347,7 @@
                       <w:sz w:val="19"/>
                       <w:szCs w:val="19"/>
                     </w:rPr>
-                    <w:t xml:space="preserve">8 Minuten · allein · leise</w:t>
+                    <w:t xml:space="preserve">5 Minuten · allein · leise</w:t>
                   </w:r>
                   <w:r>
                     <w:rPr>
@@ -5361,7 +5420,7 @@
           <w:sz w:val="28"/>
           <w:szCs w:val="28"/>
         </w:rPr>
-        <w:t xml:space="preserve">Vergleich per Kreide-Kette</w:t>
+        <w:t xml:space="preserve">Schülersätze an die Tafel</w:t>
       </w:r>
       <w:r>
         <w:rPr>
@@ -5372,7 +5431,7 @@
           <w:sz w:val="20"/>
           <w:szCs w:val="20"/>
         </w:rPr>
-        <w:t xml:space="preserve">   8 Min.</w:t>
+        <w:t xml:space="preserve">   7 Min.</w:t>
       </w:r>
     </w:p>
     <w:tbl>
@@ -5440,7 +5499,7 @@
                 <w:sz w:val="20"/>
                 <w:szCs w:val="20"/>
               </w:rPr>
-              <w:t xml:space="preserve">kommt an die Tafel</w:t>
+              <w:t xml:space="preserve">macht mündlich mit</w:t>
             </w:r>
           </w:p>
         </w:tc>
@@ -5485,7 +5544,7 @@
                 <w:sz w:val="21"/>
                 <w:szCs w:val="21"/>
               </w:rPr>
-              <w:t xml:space="preserve">„Kreide-Kette: Wer die Kreide hat, schreibt einen seiner Sätze an die Tafel, markiert werden rot und den Infinitiv blau und zeichnet die Klammer. Dann Kreide weitergeben. Alle prüfen mit: Stimmt die Form von werden? Steht der Infinitiv am Ende?“</w:t>
+              <w:t xml:space="preserve">„Meldet euch. Lest einen eurer Sätze vor. Ich schreibe fünf davon an die Tafel.“</w:t>
             </w:r>
           </w:p>
           <w:p>
@@ -5499,7 +5558,7 @@
                 <w:sz w:val="21"/>
                 <w:szCs w:val="21"/>
               </w:rPr>
-              <w:t xml:space="preserve">Fehler nicht selbst korrigieren, sondern die Klasse fragen: „Stimmt das? Prüft mit dem Test aus Merksatz 7.“</w:t>
+              <w:t xml:space="preserve">Fünf Sätze in die linke Spalte schreiben (Überschrift „Futur I“), noch ohne Farben. Rechts eine leere Spalte „Perfekt“ lassen.</w:t>
             </w:r>
           </w:p>
           <w:p>
@@ -5513,7 +5572,351 @@
                 <w:sz w:val="21"/>
                 <w:szCs w:val="21"/>
               </w:rPr>
-              <w:t xml:space="preserve">Gelungene Sätze mit anderem Satzanfang („Am Sonntag werde ich …“) hervorheben: Auch dann steht werden an Position 2.</w:t>
+              <w:t xml:space="preserve">Falls passende Sätze fehlen: Beispiele unten ergänzen.</w:t>
+            </w:r>
+          </w:p>
+          <w:tbl>
+            <w:tblPr>
+              <w:tblW w:type="dxa" w:w="8166"/>
+              <w:tblBorders>
+                <w:top w:val="single" w:color="auto" w:sz="4"/>
+                <w:left w:val="single" w:color="auto" w:sz="4"/>
+                <w:bottom w:val="single" w:color="auto" w:sz="4"/>
+                <w:right w:val="single" w:color="auto" w:sz="4"/>
+                <w:insideH w:val="single" w:color="auto" w:sz="4"/>
+                <w:insideV w:val="single" w:color="auto" w:sz="4"/>
+              </w:tblBorders>
+            </w:tblPr>
+            <w:tblGrid>
+              <w:gridCol w:w="8166"/>
+            </w:tblGrid>
+            <w:tr>
+              <w:trPr>
+                <w:cantSplit/>
+              </w:trPr>
+              <w:tc>
+                <w:tcPr>
+                  <w:tcW w:type="dxa" w:w="8166"/>
+                  <w:tcBorders>
+                    <w:top w:val="single" w:color="3D4A3F" w:sz="12"/>
+                    <w:left w:val="single" w:color="3D4A3F" w:sz="12"/>
+                    <w:bottom w:val="single" w:color="3D4A3F" w:sz="12"/>
+                    <w:right w:val="single" w:color="3D4A3F" w:sz="12"/>
+                  </w:tcBorders>
+                  <w:shd w:fill="3D4A3F" w:color="auto" w:val="clear"/>
+                  <w:tcMar>
+                    <w:top w:type="dxa" w:w="30"/>
+                    <w:left w:type="dxa" w:w="100"/>
+                    <w:bottom w:type="dxa" w:w="30"/>
+                    <w:right w:type="dxa" w:w="100"/>
+                  </w:tcMar>
+                  <w:vAlign w:val="center"/>
+                </w:tcPr>
+                <w:p>
+                  <w:pPr>
+                    <w:spacing w:after="0" w:before="0"/>
+                  </w:pPr>
+                  <w:r>
+                    <w:rPr>
+                      <w:rFonts w:ascii="Calibri" w:cs="Calibri" w:eastAsia="Calibri" w:hAnsi="Calibri"/>
+                      <w:b/>
+                      <w:bCs/>
+                      <w:color w:val="FFFFFF"/>
+                      <w:sz w:val="16"/>
+                      <w:szCs w:val="16"/>
+                    </w:rPr>
+                    <w:t xml:space="preserve">TAFEL · Mitte (Beispiel)</w:t>
+                  </w:r>
+                </w:p>
+              </w:tc>
+            </w:tr>
+            <w:tr>
+              <w:trPr>
+                <w:cantSplit/>
+              </w:trPr>
+              <w:tc>
+                <w:tcPr>
+                  <w:tcW w:type="dxa" w:w="8166"/>
+                  <w:tcBorders>
+                    <w:top w:val="single" w:color="3D4A3F" w:sz="12"/>
+                    <w:left w:val="single" w:color="3D4A3F" w:sz="12"/>
+                    <w:bottom w:val="single" w:color="3D4A3F" w:sz="12"/>
+                    <w:right w:val="single" w:color="3D4A3F" w:sz="12"/>
+                  </w:tcBorders>
+                  <w:shd w:fill="F3F6F1" w:color="auto" w:val="clear"/>
+                  <w:tcMar>
+                    <w:top w:type="dxa" w:w="100"/>
+                    <w:left w:type="dxa" w:w="160"/>
+                    <w:bottom w:type="dxa" w:w="100"/>
+                    <w:right w:type="dxa" w:w="100"/>
+                  </w:tcMar>
+                  <w:vAlign w:val="center"/>
+                </w:tcPr>
+                <w:p>
+                  <w:pPr>
+                    <w:spacing w:after="30" w:before="0"/>
+                  </w:pPr>
+                  <w:r>
+                    <w:rPr>
+                      <w:rFonts w:ascii="Cambria" w:cs="Cambria" w:eastAsia="Cambria" w:hAnsi="Cambria"/>
+                      <w:color w:val="000000"/>
+                      <w:sz w:val="22"/>
+                      <w:szCs w:val="22"/>
+                    </w:rPr>
+                    <w:t xml:space="preserve">Am Samstag </w:t>
+                  </w:r>
+                  <w:r>
+                    <w:rPr>
+                      <w:rFonts w:ascii="Cambria" w:cs="Cambria" w:eastAsia="Cambria" w:hAnsi="Cambria"/>
+                      <w:color w:val="000000"/>
+                      <w:sz w:val="22"/>
+                      <w:szCs w:val="22"/>
+                    </w:rPr>
+                    <w:t xml:space="preserve">werde</w:t>
+                  </w:r>
+                  <w:r>
+                    <w:rPr>
+                      <w:rFonts w:ascii="Cambria" w:cs="Cambria" w:eastAsia="Cambria" w:hAnsi="Cambria"/>
+                      <w:color w:val="000000"/>
+                      <w:sz w:val="22"/>
+                      <w:szCs w:val="22"/>
+                    </w:rPr>
+                    <w:t xml:space="preserve"> ich </w:t>
+                  </w:r>
+                  <w:r>
+                    <w:rPr>
+                      <w:rFonts w:ascii="Cambria" w:cs="Cambria" w:eastAsia="Cambria" w:hAnsi="Cambria"/>
+                      <w:color w:val="000000"/>
+                      <w:sz w:val="22"/>
+                      <w:szCs w:val="22"/>
+                    </w:rPr>
+                    <w:t xml:space="preserve">ausschlafen</w:t>
+                  </w:r>
+                  <w:r>
+                    <w:rPr>
+                      <w:rFonts w:ascii="Cambria" w:cs="Cambria" w:eastAsia="Cambria" w:hAnsi="Cambria"/>
+                      <w:color w:val="000000"/>
+                      <w:sz w:val="22"/>
+                      <w:szCs w:val="22"/>
+                    </w:rPr>
+                    <w:t xml:space="preserve">.</w:t>
+                  </w:r>
+                </w:p>
+                <w:p>
+                  <w:pPr>
+                    <w:spacing w:after="30" w:before="0"/>
+                  </w:pPr>
+                  <w:r>
+                    <w:rPr>
+                      <w:rFonts w:ascii="Cambria" w:cs="Cambria" w:eastAsia="Cambria" w:hAnsi="Cambria"/>
+                      <w:color w:val="000000"/>
+                      <w:sz w:val="22"/>
+                      <w:szCs w:val="22"/>
+                    </w:rPr>
+                    <w:t xml:space="preserve">Ich </w:t>
+                  </w:r>
+                  <w:r>
+                    <w:rPr>
+                      <w:rFonts w:ascii="Cambria" w:cs="Cambria" w:eastAsia="Cambria" w:hAnsi="Cambria"/>
+                      <w:color w:val="000000"/>
+                      <w:sz w:val="22"/>
+                      <w:szCs w:val="22"/>
+                    </w:rPr>
+                    <w:t xml:space="preserve">werde</w:t>
+                  </w:r>
+                  <w:r>
+                    <w:rPr>
+                      <w:rFonts w:ascii="Cambria" w:cs="Cambria" w:eastAsia="Cambria" w:hAnsi="Cambria"/>
+                      <w:color w:val="000000"/>
+                      <w:sz w:val="22"/>
+                      <w:szCs w:val="22"/>
+                    </w:rPr>
+                    <w:t xml:space="preserve"> mit Freunden </w:t>
+                  </w:r>
+                  <w:r>
+                    <w:rPr>
+                      <w:rFonts w:ascii="Cambria" w:cs="Cambria" w:eastAsia="Cambria" w:hAnsi="Cambria"/>
+                      <w:color w:val="000000"/>
+                      <w:sz w:val="22"/>
+                      <w:szCs w:val="22"/>
+                    </w:rPr>
+                    <w:t xml:space="preserve">zocken</w:t>
+                  </w:r>
+                  <w:r>
+                    <w:rPr>
+                      <w:rFonts w:ascii="Cambria" w:cs="Cambria" w:eastAsia="Cambria" w:hAnsi="Cambria"/>
+                      <w:color w:val="000000"/>
+                      <w:sz w:val="22"/>
+                      <w:szCs w:val="22"/>
+                    </w:rPr>
+                    <w:t xml:space="preserve">.</w:t>
+                  </w:r>
+                </w:p>
+                <w:p>
+                  <w:pPr>
+                    <w:spacing w:after="30" w:before="0"/>
+                  </w:pPr>
+                  <w:r>
+                    <w:rPr>
+                      <w:rFonts w:ascii="Cambria" w:cs="Cambria" w:eastAsia="Cambria" w:hAnsi="Cambria"/>
+                      <w:color w:val="000000"/>
+                      <w:sz w:val="22"/>
+                      <w:szCs w:val="22"/>
+                    </w:rPr>
+                    <w:t xml:space="preserve">Wir </w:t>
+                  </w:r>
+                  <w:r>
+                    <w:rPr>
+                      <w:rFonts w:ascii="Cambria" w:cs="Cambria" w:eastAsia="Cambria" w:hAnsi="Cambria"/>
+                      <w:color w:val="000000"/>
+                      <w:sz w:val="22"/>
+                      <w:szCs w:val="22"/>
+                    </w:rPr>
+                    <w:t xml:space="preserve">werden</w:t>
+                  </w:r>
+                  <w:r>
+                    <w:rPr>
+                      <w:rFonts w:ascii="Cambria" w:cs="Cambria" w:eastAsia="Cambria" w:hAnsi="Cambria"/>
+                      <w:color w:val="000000"/>
+                      <w:sz w:val="22"/>
+                      <w:szCs w:val="22"/>
+                    </w:rPr>
+                    <w:t xml:space="preserve"> ins Kino </w:t>
+                  </w:r>
+                  <w:r>
+                    <w:rPr>
+                      <w:rFonts w:ascii="Cambria" w:cs="Cambria" w:eastAsia="Cambria" w:hAnsi="Cambria"/>
+                      <w:color w:val="000000"/>
+                      <w:sz w:val="22"/>
+                      <w:szCs w:val="22"/>
+                    </w:rPr>
+                    <w:t xml:space="preserve">gehen</w:t>
+                  </w:r>
+                  <w:r>
+                    <w:rPr>
+                      <w:rFonts w:ascii="Cambria" w:cs="Cambria" w:eastAsia="Cambria" w:hAnsi="Cambria"/>
+                      <w:color w:val="000000"/>
+                      <w:sz w:val="22"/>
+                      <w:szCs w:val="22"/>
+                    </w:rPr>
+                    <w:t xml:space="preserve">.</w:t>
+                  </w:r>
+                </w:p>
+                <w:p>
+                  <w:pPr>
+                    <w:spacing w:after="30" w:before="0"/>
+                  </w:pPr>
+                  <w:r>
+                    <w:rPr>
+                      <w:rFonts w:ascii="Cambria" w:cs="Cambria" w:eastAsia="Cambria" w:hAnsi="Cambria"/>
+                      <w:color w:val="000000"/>
+                      <w:sz w:val="22"/>
+                      <w:szCs w:val="22"/>
+                    </w:rPr>
+                    <w:t xml:space="preserve">Mein Bruder </w:t>
+                  </w:r>
+                  <w:r>
+                    <w:rPr>
+                      <w:rFonts w:ascii="Cambria" w:cs="Cambria" w:eastAsia="Cambria" w:hAnsi="Cambria"/>
+                      <w:color w:val="000000"/>
+                      <w:sz w:val="22"/>
+                      <w:szCs w:val="22"/>
+                    </w:rPr>
+                    <w:t xml:space="preserve">wird</w:t>
+                  </w:r>
+                  <w:r>
+                    <w:rPr>
+                      <w:rFonts w:ascii="Cambria" w:cs="Cambria" w:eastAsia="Cambria" w:hAnsi="Cambria"/>
+                      <w:color w:val="000000"/>
+                      <w:sz w:val="22"/>
+                      <w:szCs w:val="22"/>
+                    </w:rPr>
+                    <w:t xml:space="preserve"> Fußball </w:t>
+                  </w:r>
+                  <w:r>
+                    <w:rPr>
+                      <w:rFonts w:ascii="Cambria" w:cs="Cambria" w:eastAsia="Cambria" w:hAnsi="Cambria"/>
+                      <w:color w:val="000000"/>
+                      <w:sz w:val="22"/>
+                      <w:szCs w:val="22"/>
+                    </w:rPr>
+                    <w:t xml:space="preserve">spielen</w:t>
+                  </w:r>
+                  <w:r>
+                    <w:rPr>
+                      <w:rFonts w:ascii="Cambria" w:cs="Cambria" w:eastAsia="Cambria" w:hAnsi="Cambria"/>
+                      <w:color w:val="000000"/>
+                      <w:sz w:val="22"/>
+                      <w:szCs w:val="22"/>
+                    </w:rPr>
+                    <w:t xml:space="preserve">.</w:t>
+                  </w:r>
+                </w:p>
+                <w:p>
+                  <w:pPr>
+                    <w:spacing w:after="0" w:before="0"/>
+                  </w:pPr>
+                  <w:r>
+                    <w:rPr>
+                      <w:rFonts w:ascii="Cambria" w:cs="Cambria" w:eastAsia="Cambria" w:hAnsi="Cambria"/>
+                      <w:color w:val="000000"/>
+                      <w:sz w:val="22"/>
+                      <w:szCs w:val="22"/>
+                    </w:rPr>
+                    <w:t xml:space="preserve">Am Sonntag </w:t>
+                  </w:r>
+                  <w:r>
+                    <w:rPr>
+                      <w:rFonts w:ascii="Cambria" w:cs="Cambria" w:eastAsia="Cambria" w:hAnsi="Cambria"/>
+                      <w:color w:val="000000"/>
+                      <w:sz w:val="22"/>
+                      <w:szCs w:val="22"/>
+                    </w:rPr>
+                    <w:t xml:space="preserve">werde</w:t>
+                  </w:r>
+                  <w:r>
+                    <w:rPr>
+                      <w:rFonts w:ascii="Cambria" w:cs="Cambria" w:eastAsia="Cambria" w:hAnsi="Cambria"/>
+                      <w:color w:val="000000"/>
+                      <w:sz w:val="22"/>
+                      <w:szCs w:val="22"/>
+                    </w:rPr>
+                    <w:t xml:space="preserve"> ich zu Oma </w:t>
+                  </w:r>
+                  <w:r>
+                    <w:rPr>
+                      <w:rFonts w:ascii="Cambria" w:cs="Cambria" w:eastAsia="Cambria" w:hAnsi="Cambria"/>
+                      <w:color w:val="000000"/>
+                      <w:sz w:val="22"/>
+                      <w:szCs w:val="22"/>
+                    </w:rPr>
+                    <w:t xml:space="preserve">fahren</w:t>
+                  </w:r>
+                  <w:r>
+                    <w:rPr>
+                      <w:rFonts w:ascii="Cambria" w:cs="Cambria" w:eastAsia="Cambria" w:hAnsi="Cambria"/>
+                      <w:color w:val="000000"/>
+                      <w:sz w:val="22"/>
+                      <w:szCs w:val="22"/>
+                    </w:rPr>
+                    <w:t xml:space="preserve">.</w:t>
+                  </w:r>
+                </w:p>
+              </w:tc>
+            </w:tr>
+          </w:tbl>
+          <w:p>
+            <w:pPr>
+              <w:spacing w:after="20" w:before="0"/>
+            </w:pPr>
+            <w:r>
+              <w:rPr>
+                <w:rFonts w:ascii="Calibri" w:cs="Calibri" w:eastAsia="Calibri" w:hAnsi="Calibri"/>
+                <w:color w:val="000000"/>
+                <w:sz w:val="22"/>
+                <w:szCs w:val="22"/>
+              </w:rPr>
+              <w:t xml:space="preserve"/>
             </w:r>
           </w:p>
         </w:tc>
@@ -5598,7 +6001,7 @@
                 <w:sz w:val="20"/>
                 <w:szCs w:val="20"/>
               </w:rPr>
-              <w:t xml:space="preserve">kontrolliert</w:t>
+              <w:t xml:space="preserve">kommt an die Tafel</w:t>
             </w:r>
           </w:p>
         </w:tc>
@@ -5643,7 +6046,21 @@
                 <w:sz w:val="21"/>
                 <w:szCs w:val="21"/>
               </w:rPr>
-              <w:t xml:space="preserve">„Vergleicht eure Sätze mit der Tafel und verbessert mit Grün.“</w:t>
+              <w:t xml:space="preserve">„Kreide-Kette: Wer die Kreide hat, markiert in einem Satz werden rot und den Infinitiv blau und zeichnet die Klammer. Alle anderen schreiben die Sätze als Ü7 b in die linke Spalte im Heft mit.“</w:t>
+            </w:r>
+          </w:p>
+          <w:p>
+            <w:pPr>
+              <w:spacing w:after="50" w:before="0"/>
+            </w:pPr>
+            <w:r>
+              <w:rPr>
+                <w:rFonts w:ascii="Calibri" w:cs="Calibri" w:eastAsia="Calibri" w:hAnsi="Calibri"/>
+                <w:color w:val="000000"/>
+                <w:sz w:val="21"/>
+                <w:szCs w:val="21"/>
+              </w:rPr>
+              <w:t xml:space="preserve">Heft-Ansage vorher: „Zeichnet zwei Spalten: links Futur I, rechts Perfekt. Die rechte bleibt erst einmal leer.“</w:t>
             </w:r>
           </w:p>
         </w:tc>
@@ -5688,7 +6105,7 @@
           <w:sz w:val="28"/>
           <w:szCs w:val="28"/>
         </w:rPr>
-        <w:t xml:space="preserve">Optional: Perfekt oder Futur I?</w:t>
+        <w:t xml:space="preserve">Ü7 b Zurück ins Perfekt</w:t>
       </w:r>
       <w:r>
         <w:rPr>
@@ -5699,23 +6116,7 @@
           <w:sz w:val="20"/>
           <w:szCs w:val="20"/>
         </w:rPr>
-        <w:t xml:space="preserve">   3 Min.</w:t>
-      </w:r>
-    </w:p>
-    <w:p>
-      <w:pPr>
-        <w:spacing w:after="80" w:before="0"/>
-      </w:pPr>
-      <w:r>
-        <w:rPr>
-          <w:rFonts w:ascii="Calibri" w:cs="Calibri" w:eastAsia="Calibri" w:hAnsi="Calibri"/>
-          <w:i/>
-          <w:iCs/>
-          <w:color w:val="5B6B8C"/>
-          <w:sz w:val="20"/>
-          <w:szCs w:val="20"/>
-        </w:rPr>
-        <w:t xml:space="preserve">Nur, wenn noch Zeit bleibt – sonst als Einstieg der nächsten Stunde.</w:t>
+        <w:t xml:space="preserve">   10 Min.</w:t>
       </w:r>
     </w:p>
     <w:tbl>
@@ -5783,7 +6184,7 @@
                 <w:sz w:val="20"/>
                 <w:szCs w:val="20"/>
               </w:rPr>
-              <w:t xml:space="preserve">macht mündlich mit</w:t>
+              <w:t xml:space="preserve">hört zu</w:t>
             </w:r>
           </w:p>
         </w:tc>
@@ -5828,7 +6229,7 @@
                 <w:sz w:val="21"/>
                 <w:szCs w:val="21"/>
               </w:rPr>
-              <w:t xml:space="preserve">„Meldet euch. Ihr schreibt nichts auf. Gestern oder morgen? Und woran erkennt ihr das?“</w:t>
+              <w:t xml:space="preserve">„Stifte liegen. Ihr hört nur zu. Stellt euch vor, es ist Montag, und ich frage euch: Was habt ihr am Wochenende gemacht? Was müsst ihr an den Sätzen ändern?“</w:t>
             </w:r>
           </w:p>
           <w:p>
@@ -5842,7 +6243,165 @@
                 <w:sz w:val="21"/>
                 <w:szCs w:val="21"/>
               </w:rPr>
-              <w:t xml:space="preserve">Erkenntnis: Beide Zeitformen sind eine Klammer. Am linken Teil (habe/sind oder werde) und am rechten Teil (Partizip II oder Infinitiv) erkennt man die Zeitform.</w:t>
+              <w:t xml:space="preserve">Erwartung: Das Wochenende ist vorbei → Vergangenheit → Perfekt. Statt werde kommt habe oder bin, statt des Infinitivs das Partizip II.</w:t>
+            </w:r>
+          </w:p>
+        </w:tc>
+      </w:tr>
+    </w:tbl>
+    <w:p>
+      <w:pPr>
+        <w:spacing w:after="40" w:before="0"/>
+      </w:pPr>
+      <w:r>
+        <w:rPr>
+          <w:rFonts w:ascii="Calibri" w:cs="Calibri" w:eastAsia="Calibri" w:hAnsi="Calibri"/>
+          <w:color w:val="000000"/>
+          <w:sz w:val="22"/>
+          <w:szCs w:val="22"/>
+        </w:rPr>
+        <w:t xml:space="preserve"/>
+      </w:r>
+    </w:p>
+    <w:tbl>
+      <w:tblPr>
+        <w:tblW w:type="dxa" w:w="10206"/>
+        <w:tblBorders>
+          <w:top w:val="single" w:color="auto" w:sz="4"/>
+          <w:left w:val="single" w:color="auto" w:sz="4"/>
+          <w:bottom w:val="single" w:color="auto" w:sz="4"/>
+          <w:right w:val="single" w:color="auto" w:sz="4"/>
+          <w:insideH w:val="single" w:color="auto" w:sz="4"/>
+          <w:insideV w:val="single" w:color="auto" w:sz="4"/>
+        </w:tblBorders>
+      </w:tblPr>
+      <w:tblGrid>
+        <w:gridCol w:w="1700"/>
+        <w:gridCol w:w="8506"/>
+      </w:tblGrid>
+      <w:tr>
+        <w:trPr>
+          <w:cantSplit/>
+        </w:trPr>
+        <w:tc>
+          <w:tcPr>
+            <w:tcW w:type="dxa" w:w="1700"/>
+            <w:tcBorders>
+              <w:top w:val="single" w:color="D5DDEE" w:sz="6"/>
+              <w:left w:val="single" w:color="D5DDEE" w:sz="6"/>
+              <w:bottom w:val="single" w:color="D5DDEE" w:sz="6"/>
+              <w:right w:val="single" w:color="D5DDEE" w:sz="6"/>
+            </w:tcBorders>
+            <w:shd w:fill="F4F7FD" w:color="auto" w:val="clear"/>
+            <w:tcMar>
+              <w:top w:type="dxa" w:w="100"/>
+              <w:left w:type="dxa" w:w="100"/>
+              <w:bottom w:type="dxa" w:w="100"/>
+              <w:right w:type="dxa" w:w="100"/>
+            </w:tcMar>
+            <w:vAlign w:val="top"/>
+          </w:tcPr>
+          <w:p>
+            <w:pPr>
+              <w:spacing w:after="10" w:before="0"/>
+            </w:pPr>
+            <w:r>
+              <w:rPr>
+                <w:rFonts w:ascii="Calibri" w:cs="Calibri" w:eastAsia="Calibri" w:hAnsi="Calibri"/>
+                <w:color w:val="5B6B8C"/>
+                <w:sz w:val="16"/>
+                <w:szCs w:val="16"/>
+              </w:rPr>
+              <w:t xml:space="preserve">Klasse</w:t>
+            </w:r>
+          </w:p>
+          <w:p>
+            <w:pPr>
+              <w:spacing w:after="0" w:before="0"/>
+            </w:pPr>
+            <w:r>
+              <w:rPr>
+                <w:rFonts w:ascii="Calibri" w:cs="Calibri" w:eastAsia="Calibri" w:hAnsi="Calibri"/>
+                <w:b/>
+                <w:bCs/>
+                <w:color w:val="1E2761"/>
+                <w:sz w:val="20"/>
+                <w:szCs w:val="20"/>
+              </w:rPr>
+              <w:t xml:space="preserve">kommt an die Tafel</w:t>
+            </w:r>
+          </w:p>
+        </w:tc>
+        <w:tc>
+          <w:tcPr>
+            <w:tcW w:type="dxa" w:w="8506"/>
+            <w:tcBorders>
+              <w:top w:val="single" w:color="D5DDEE" w:sz="6"/>
+              <w:left w:val="single" w:color="D5DDEE" w:sz="6"/>
+              <w:bottom w:val="single" w:color="D5DDEE" w:sz="6"/>
+              <w:right w:val="single" w:color="D5DDEE" w:sz="6"/>
+            </w:tcBorders>
+            <w:tcMar>
+              <w:top w:type="dxa" w:w="100"/>
+              <w:left w:type="dxa" w:w="160"/>
+              <w:bottom w:type="dxa" w:w="100"/>
+              <w:right w:type="dxa" w:w="100"/>
+            </w:tcMar>
+            <w:vAlign w:val="top"/>
+          </w:tcPr>
+          <w:p>
+            <w:pPr>
+              <w:spacing w:after="60" w:before="0"/>
+            </w:pPr>
+            <w:r>
+              <w:rPr>
+                <w:rFonts w:ascii="Calibri" w:cs="Calibri" w:eastAsia="Calibri" w:hAnsi="Calibri"/>
+                <w:b/>
+                <w:bCs/>
+                <w:color w:val="D9534F"/>
+                <w:sz w:val="20"/>
+                <w:szCs w:val="20"/>
+              </w:rPr>
+              <w:t xml:space="preserve">Ansage: </w:t>
+            </w:r>
+            <w:r>
+              <w:rPr>
+                <w:rFonts w:ascii="Calibri" w:cs="Calibri" w:eastAsia="Calibri" w:hAnsi="Calibri"/>
+                <w:i/>
+                <w:iCs/>
+                <w:color w:val="000000"/>
+                <w:sz w:val="21"/>
+                <w:szCs w:val="21"/>
+              </w:rPr>
+              <w:t xml:space="preserve">„Kreide-Kette: Wer die Kreide hat, schreibt einen Satz rechts ins Perfekt – Hilfsverb rot, Partizip II gelb, Klammer drunter. Alle anderen schreiben im Heft in der rechten Spalte mit. Alle prüfen mit.“</w:t>
+            </w:r>
+          </w:p>
+          <w:p>
+            <w:pPr>
+              <w:spacing w:after="50" w:before="0"/>
+            </w:pPr>
+            <w:r>
+              <w:rPr>
+                <w:rFonts w:ascii="Calibri" w:cs="Calibri" w:eastAsia="Calibri" w:hAnsi="Calibri"/>
+                <w:color w:val="000000"/>
+                <w:sz w:val="21"/>
+                <w:szCs w:val="21"/>
+              </w:rPr>
+              <w:t xml:space="preserve">Bei gehen und fahren hakt es vermutlich (haben oder sein?). Kurz klären, ohne neue Regel: „Hört sich ‚wir haben ins Kino gegangen‘ richtig an? Bei Bewegung von A nach B nimmt man sein.“ Die Regel kommt ausführlich in einer späteren Stunde.</w:t>
+            </w:r>
+          </w:p>
+          <w:p>
+            <w:pPr>
+              <w:spacing w:after="50" w:before="0"/>
+            </w:pPr>
+            <w:r>
+              <w:rPr>
+                <w:rFonts w:ascii="Calibri" w:cs="Calibri" w:eastAsia="Calibri" w:hAnsi="Calibri"/>
+                <w:color w:val="000000"/>
+                <w:sz w:val="21"/>
+                <w:szCs w:val="21"/>
+              </w:rPr>
+              <w:t xml:space="preserve">ausschlafen → ausgeschlafen: ge- steht in der Mitte (trennbares Verb).</w:t>
             </w:r>
           </w:p>
           <w:tbl>
@@ -5895,7 +6454,7 @@
                       <w:sz w:val="16"/>
                       <w:szCs w:val="16"/>
                     </w:rPr>
-                    <w:t xml:space="preserve">TAFEL · Mitte</w:t>
+                    <w:t xml:space="preserve">TAFEL · Mitte · zwei Spalten</w:t>
                   </w:r>
                 </w:p>
               </w:tc>
@@ -5922,62 +6481,842 @@
                   </w:tcMar>
                   <w:vAlign w:val="center"/>
                 </w:tcPr>
-                <w:p>
-                  <w:pPr>
-                    <w:spacing w:after="30" w:before="0"/>
-                  </w:pPr>
-                  <w:r>
-                    <w:rPr>
-                      <w:rFonts w:ascii="Cambria" w:cs="Cambria" w:eastAsia="Cambria" w:hAnsi="Cambria"/>
-                      <w:color w:val="000000"/>
-                      <w:sz w:val="22"/>
-                      <w:szCs w:val="22"/>
-                    </w:rPr>
-                    <w:t xml:space="preserve">1  Ich habe Fußball gespielt.</w:t>
-                  </w:r>
-                </w:p>
-                <w:p>
-                  <w:pPr>
-                    <w:spacing w:after="30" w:before="0"/>
-                  </w:pPr>
-                  <w:r>
-                    <w:rPr>
-                      <w:rFonts w:ascii="Cambria" w:cs="Cambria" w:eastAsia="Cambria" w:hAnsi="Cambria"/>
-                      <w:color w:val="000000"/>
-                      <w:sz w:val="22"/>
-                      <w:szCs w:val="22"/>
-                    </w:rPr>
-                    <w:t xml:space="preserve">2  Ich werde Fußball spielen.</w:t>
-                  </w:r>
-                </w:p>
-                <w:p>
-                  <w:pPr>
-                    <w:spacing w:after="30" w:before="0"/>
-                  </w:pPr>
-                  <w:r>
-                    <w:rPr>
-                      <w:rFonts w:ascii="Cambria" w:cs="Cambria" w:eastAsia="Cambria" w:hAnsi="Cambria"/>
-                      <w:color w:val="000000"/>
-                      <w:sz w:val="22"/>
-                      <w:szCs w:val="22"/>
-                    </w:rPr>
-                    <w:t xml:space="preserve">3  Wir sind ins Kino gegangen.</w:t>
-                  </w:r>
-                </w:p>
-                <w:p>
-                  <w:pPr>
-                    <w:spacing w:after="0" w:before="0"/>
-                  </w:pPr>
-                  <w:r>
-                    <w:rPr>
-                      <w:rFonts w:ascii="Cambria" w:cs="Cambria" w:eastAsia="Cambria" w:hAnsi="Cambria"/>
-                      <w:color w:val="000000"/>
-                      <w:sz w:val="22"/>
-                      <w:szCs w:val="22"/>
-                    </w:rPr>
-                    <w:t xml:space="preserve">4  Wir werden ins Kino gehen.</w:t>
-                  </w:r>
-                </w:p>
+                <w:tbl>
+                  <w:tblPr>
+                    <w:tblW w:type="dxa" w:w="7800"/>
+                    <w:tblBorders>
+                      <w:top w:val="single" w:color="auto" w:sz="4"/>
+                      <w:left w:val="single" w:color="auto" w:sz="4"/>
+                      <w:bottom w:val="single" w:color="auto" w:sz="4"/>
+                      <w:right w:val="single" w:color="auto" w:sz="4"/>
+                      <w:insideH w:val="single" w:color="auto" w:sz="4"/>
+                      <w:insideV w:val="single" w:color="auto" w:sz="4"/>
+                    </w:tblBorders>
+                  </w:tblPr>
+                  <w:tblGrid>
+                    <w:gridCol w:w="3900"/>
+                    <w:gridCol w:w="3900"/>
+                  </w:tblGrid>
+                  <w:tr>
+                    <w:trPr>
+                      <w:cantSplit/>
+                    </w:trPr>
+                    <w:tc>
+                      <w:tcPr>
+                        <w:tcW w:type="dxa" w:w="3900"/>
+                        <w:tcBorders>
+                          <w:top w:val="none" w:color="FFFFFF" w:sz="0"/>
+                          <w:left w:val="none" w:color="FFFFFF" w:sz="0"/>
+                          <w:bottom w:val="none" w:color="FFFFFF" w:sz="0"/>
+                          <w:right w:val="none" w:color="FFFFFF" w:sz="0"/>
+                        </w:tcBorders>
+                        <w:tcMar>
+                          <w:top w:type="dxa" w:w="60"/>
+                          <w:left w:type="dxa" w:w="100"/>
+                          <w:bottom w:type="dxa" w:w="60"/>
+                          <w:right w:type="dxa" w:w="100"/>
+                        </w:tcMar>
+                        <w:vAlign w:val="center"/>
+                      </w:tcPr>
+                      <w:p>
+                        <w:pPr>
+                          <w:spacing w:after="0" w:before="0"/>
+                        </w:pPr>
+                        <w:r>
+                          <w:rPr>
+                            <w:rFonts w:ascii="Cambria" w:cs="Cambria" w:eastAsia="Cambria" w:hAnsi="Cambria"/>
+                            <w:b/>
+                            <w:bCs/>
+                            <w:color w:val="1E2761"/>
+                            <w:sz w:val="22"/>
+                            <w:szCs w:val="22"/>
+                          </w:rPr>
+                          <w:t xml:space="preserve">Futur I</w:t>
+                        </w:r>
+                      </w:p>
+                    </w:tc>
+                    <w:tc>
+                      <w:tcPr>
+                        <w:tcW w:type="dxa" w:w="3900"/>
+                        <w:tcBorders>
+                          <w:top w:val="none" w:color="FFFFFF" w:sz="0"/>
+                          <w:left w:val="none" w:color="FFFFFF" w:sz="0"/>
+                          <w:bottom w:val="none" w:color="FFFFFF" w:sz="0"/>
+                          <w:right w:val="none" w:color="FFFFFF" w:sz="0"/>
+                        </w:tcBorders>
+                        <w:tcMar>
+                          <w:top w:type="dxa" w:w="60"/>
+                          <w:left w:type="dxa" w:w="100"/>
+                          <w:bottom w:type="dxa" w:w="60"/>
+                          <w:right w:type="dxa" w:w="100"/>
+                        </w:tcMar>
+                        <w:vAlign w:val="center"/>
+                      </w:tcPr>
+                      <w:p>
+                        <w:pPr>
+                          <w:spacing w:after="0" w:before="0"/>
+                        </w:pPr>
+                        <w:r>
+                          <w:rPr>
+                            <w:rFonts w:ascii="Cambria" w:cs="Cambria" w:eastAsia="Cambria" w:hAnsi="Cambria"/>
+                            <w:b/>
+                            <w:bCs/>
+                            <w:color w:val="1E2761"/>
+                            <w:sz w:val="22"/>
+                            <w:szCs w:val="22"/>
+                          </w:rPr>
+                          <w:t xml:space="preserve">Perfekt</w:t>
+                        </w:r>
+                      </w:p>
+                    </w:tc>
+                  </w:tr>
+                  <w:tr>
+                    <w:trPr>
+                      <w:cantSplit/>
+                    </w:trPr>
+                    <w:tc>
+                      <w:tcPr>
+                        <w:tcW w:type="dxa" w:w="3900"/>
+                        <w:tcBorders>
+                          <w:top w:val="none" w:color="FFFFFF" w:sz="0"/>
+                          <w:left w:val="none" w:color="FFFFFF" w:sz="0"/>
+                          <w:bottom w:val="none" w:color="FFFFFF" w:sz="0"/>
+                          <w:right w:val="none" w:color="FFFFFF" w:sz="0"/>
+                        </w:tcBorders>
+                        <w:tcMar>
+                          <w:top w:type="dxa" w:w="15"/>
+                          <w:left w:type="dxa" w:w="100"/>
+                          <w:bottom w:type="dxa" w:w="15"/>
+                          <w:right w:type="dxa" w:w="100"/>
+                        </w:tcMar>
+                        <w:vAlign w:val="center"/>
+                      </w:tcPr>
+                      <w:p>
+                        <w:pPr>
+                          <w:spacing w:after="0" w:before="0"/>
+                        </w:pPr>
+                        <w:r>
+                          <w:rPr>
+                            <w:rFonts w:ascii="Cambria" w:cs="Cambria" w:eastAsia="Cambria" w:hAnsi="Cambria"/>
+                            <w:color w:val="000000"/>
+                            <w:sz w:val="19"/>
+                            <w:szCs w:val="19"/>
+                          </w:rPr>
+                          <w:t xml:space="preserve">Am Samstag </w:t>
+                        </w:r>
+                        <w:r>
+                          <w:rPr>
+                            <w:rFonts w:ascii="Cambria" w:cs="Cambria" w:eastAsia="Cambria" w:hAnsi="Cambria"/>
+                            <w:b/>
+                            <w:bCs/>
+                            <w:color w:val="D9534F"/>
+                            <w:sz w:val="19"/>
+                            <w:szCs w:val="19"/>
+                          </w:rPr>
+                          <w:t xml:space="preserve">werde</w:t>
+                        </w:r>
+                        <w:r>
+                          <w:rPr>
+                            <w:rFonts w:ascii="Cambria" w:cs="Cambria" w:eastAsia="Cambria" w:hAnsi="Cambria"/>
+                            <w:color w:val="000000"/>
+                            <w:sz w:val="19"/>
+                            <w:szCs w:val="19"/>
+                          </w:rPr>
+                          <w:t xml:space="preserve"> ich </w:t>
+                        </w:r>
+                        <w:r>
+                          <w:rPr>
+                            <w:rFonts w:ascii="Cambria" w:cs="Cambria" w:eastAsia="Cambria" w:hAnsi="Cambria"/>
+                            <w:b/>
+                            <w:bCs/>
+                            <w:color w:val="3F7CC4"/>
+                            <w:sz w:val="19"/>
+                            <w:szCs w:val="19"/>
+                          </w:rPr>
+                          <w:t xml:space="preserve">ausschlafen</w:t>
+                        </w:r>
+                        <w:r>
+                          <w:rPr>
+                            <w:rFonts w:ascii="Cambria" w:cs="Cambria" w:eastAsia="Cambria" w:hAnsi="Cambria"/>
+                            <w:color w:val="000000"/>
+                            <w:sz w:val="19"/>
+                            <w:szCs w:val="19"/>
+                          </w:rPr>
+                          <w:t xml:space="preserve">.</w:t>
+                        </w:r>
+                      </w:p>
+                    </w:tc>
+                    <w:tc>
+                      <w:tcPr>
+                        <w:tcW w:type="dxa" w:w="3900"/>
+                        <w:tcBorders>
+                          <w:top w:val="none" w:color="FFFFFF" w:sz="0"/>
+                          <w:left w:val="none" w:color="FFFFFF" w:sz="0"/>
+                          <w:bottom w:val="none" w:color="FFFFFF" w:sz="0"/>
+                          <w:right w:val="none" w:color="FFFFFF" w:sz="0"/>
+                        </w:tcBorders>
+                        <w:tcMar>
+                          <w:top w:type="dxa" w:w="15"/>
+                          <w:left w:type="dxa" w:w="100"/>
+                          <w:bottom w:type="dxa" w:w="15"/>
+                          <w:right w:type="dxa" w:w="100"/>
+                        </w:tcMar>
+                        <w:vAlign w:val="center"/>
+                      </w:tcPr>
+                      <w:p>
+                        <w:pPr>
+                          <w:spacing w:after="0" w:before="0"/>
+                        </w:pPr>
+                        <w:r>
+                          <w:rPr>
+                            <w:rFonts w:ascii="Cambria" w:cs="Cambria" w:eastAsia="Cambria" w:hAnsi="Cambria"/>
+                            <w:color w:val="000000"/>
+                            <w:sz w:val="19"/>
+                            <w:szCs w:val="19"/>
+                          </w:rPr>
+                          <w:t xml:space="preserve">Am Samstag </w:t>
+                        </w:r>
+                        <w:r>
+                          <w:rPr>
+                            <w:rFonts w:ascii="Cambria" w:cs="Cambria" w:eastAsia="Cambria" w:hAnsi="Cambria"/>
+                            <w:b/>
+                            <w:bCs/>
+                            <w:color w:val="D9534F"/>
+                            <w:sz w:val="19"/>
+                            <w:szCs w:val="19"/>
+                          </w:rPr>
+                          <w:t xml:space="preserve">habe</w:t>
+                        </w:r>
+                        <w:r>
+                          <w:rPr>
+                            <w:rFonts w:ascii="Cambria" w:cs="Cambria" w:eastAsia="Cambria" w:hAnsi="Cambria"/>
+                            <w:color w:val="000000"/>
+                            <w:sz w:val="19"/>
+                            <w:szCs w:val="19"/>
+                          </w:rPr>
+                          <w:t xml:space="preserve"> ich </w:t>
+                        </w:r>
+                        <w:r>
+                          <w:rPr>
+                            <w:rFonts w:ascii="Cambria" w:cs="Cambria" w:eastAsia="Cambria" w:hAnsi="Cambria"/>
+                            <w:b/>
+                            <w:bCs/>
+                            <w:color w:val="C98A1E"/>
+                            <w:sz w:val="19"/>
+                            <w:szCs w:val="19"/>
+                          </w:rPr>
+                          <w:t xml:space="preserve">ausgeschlafen</w:t>
+                        </w:r>
+                        <w:r>
+                          <w:rPr>
+                            <w:rFonts w:ascii="Cambria" w:cs="Cambria" w:eastAsia="Cambria" w:hAnsi="Cambria"/>
+                            <w:color w:val="000000"/>
+                            <w:sz w:val="19"/>
+                            <w:szCs w:val="19"/>
+                          </w:rPr>
+                          <w:t xml:space="preserve">.</w:t>
+                        </w:r>
+                      </w:p>
+                    </w:tc>
+                  </w:tr>
+                  <w:tr>
+                    <w:trPr>
+                      <w:cantSplit/>
+                    </w:trPr>
+                    <w:tc>
+                      <w:tcPr>
+                        <w:tcW w:type="dxa" w:w="3900"/>
+                        <w:tcBorders>
+                          <w:top w:val="none" w:color="FFFFFF" w:sz="0"/>
+                          <w:left w:val="none" w:color="FFFFFF" w:sz="0"/>
+                          <w:bottom w:val="none" w:color="FFFFFF" w:sz="0"/>
+                          <w:right w:val="none" w:color="FFFFFF" w:sz="0"/>
+                        </w:tcBorders>
+                        <w:tcMar>
+                          <w:top w:type="dxa" w:w="15"/>
+                          <w:left w:type="dxa" w:w="100"/>
+                          <w:bottom w:type="dxa" w:w="15"/>
+                          <w:right w:type="dxa" w:w="100"/>
+                        </w:tcMar>
+                        <w:vAlign w:val="center"/>
+                      </w:tcPr>
+                      <w:p>
+                        <w:pPr>
+                          <w:spacing w:after="0" w:before="0"/>
+                        </w:pPr>
+                        <w:r>
+                          <w:rPr>
+                            <w:rFonts w:ascii="Cambria" w:cs="Cambria" w:eastAsia="Cambria" w:hAnsi="Cambria"/>
+                            <w:color w:val="000000"/>
+                            <w:sz w:val="19"/>
+                            <w:szCs w:val="19"/>
+                          </w:rPr>
+                          <w:t xml:space="preserve">Ich </w:t>
+                        </w:r>
+                        <w:r>
+                          <w:rPr>
+                            <w:rFonts w:ascii="Cambria" w:cs="Cambria" w:eastAsia="Cambria" w:hAnsi="Cambria"/>
+                            <w:b/>
+                            <w:bCs/>
+                            <w:color w:val="D9534F"/>
+                            <w:sz w:val="19"/>
+                            <w:szCs w:val="19"/>
+                          </w:rPr>
+                          <w:t xml:space="preserve">werde</w:t>
+                        </w:r>
+                        <w:r>
+                          <w:rPr>
+                            <w:rFonts w:ascii="Cambria" w:cs="Cambria" w:eastAsia="Cambria" w:hAnsi="Cambria"/>
+                            <w:color w:val="000000"/>
+                            <w:sz w:val="19"/>
+                            <w:szCs w:val="19"/>
+                          </w:rPr>
+                          <w:t xml:space="preserve"> mit Freunden </w:t>
+                        </w:r>
+                        <w:r>
+                          <w:rPr>
+                            <w:rFonts w:ascii="Cambria" w:cs="Cambria" w:eastAsia="Cambria" w:hAnsi="Cambria"/>
+                            <w:b/>
+                            <w:bCs/>
+                            <w:color w:val="3F7CC4"/>
+                            <w:sz w:val="19"/>
+                            <w:szCs w:val="19"/>
+                          </w:rPr>
+                          <w:t xml:space="preserve">zocken</w:t>
+                        </w:r>
+                        <w:r>
+                          <w:rPr>
+                            <w:rFonts w:ascii="Cambria" w:cs="Cambria" w:eastAsia="Cambria" w:hAnsi="Cambria"/>
+                            <w:color w:val="000000"/>
+                            <w:sz w:val="19"/>
+                            <w:szCs w:val="19"/>
+                          </w:rPr>
+                          <w:t xml:space="preserve">.</w:t>
+                        </w:r>
+                      </w:p>
+                    </w:tc>
+                    <w:tc>
+                      <w:tcPr>
+                        <w:tcW w:type="dxa" w:w="3900"/>
+                        <w:tcBorders>
+                          <w:top w:val="none" w:color="FFFFFF" w:sz="0"/>
+                          <w:left w:val="none" w:color="FFFFFF" w:sz="0"/>
+                          <w:bottom w:val="none" w:color="FFFFFF" w:sz="0"/>
+                          <w:right w:val="none" w:color="FFFFFF" w:sz="0"/>
+                        </w:tcBorders>
+                        <w:tcMar>
+                          <w:top w:type="dxa" w:w="15"/>
+                          <w:left w:type="dxa" w:w="100"/>
+                          <w:bottom w:type="dxa" w:w="15"/>
+                          <w:right w:type="dxa" w:w="100"/>
+                        </w:tcMar>
+                        <w:vAlign w:val="center"/>
+                      </w:tcPr>
+                      <w:p>
+                        <w:pPr>
+                          <w:spacing w:after="0" w:before="0"/>
+                        </w:pPr>
+                        <w:r>
+                          <w:rPr>
+                            <w:rFonts w:ascii="Cambria" w:cs="Cambria" w:eastAsia="Cambria" w:hAnsi="Cambria"/>
+                            <w:color w:val="000000"/>
+                            <w:sz w:val="19"/>
+                            <w:szCs w:val="19"/>
+                          </w:rPr>
+                          <w:t xml:space="preserve">Ich </w:t>
+                        </w:r>
+                        <w:r>
+                          <w:rPr>
+                            <w:rFonts w:ascii="Cambria" w:cs="Cambria" w:eastAsia="Cambria" w:hAnsi="Cambria"/>
+                            <w:b/>
+                            <w:bCs/>
+                            <w:color w:val="D9534F"/>
+                            <w:sz w:val="19"/>
+                            <w:szCs w:val="19"/>
+                          </w:rPr>
+                          <w:t xml:space="preserve">habe</w:t>
+                        </w:r>
+                        <w:r>
+                          <w:rPr>
+                            <w:rFonts w:ascii="Cambria" w:cs="Cambria" w:eastAsia="Cambria" w:hAnsi="Cambria"/>
+                            <w:color w:val="000000"/>
+                            <w:sz w:val="19"/>
+                            <w:szCs w:val="19"/>
+                          </w:rPr>
+                          <w:t xml:space="preserve"> mit Freunden </w:t>
+                        </w:r>
+                        <w:r>
+                          <w:rPr>
+                            <w:rFonts w:ascii="Cambria" w:cs="Cambria" w:eastAsia="Cambria" w:hAnsi="Cambria"/>
+                            <w:b/>
+                            <w:bCs/>
+                            <w:color w:val="C98A1E"/>
+                            <w:sz w:val="19"/>
+                            <w:szCs w:val="19"/>
+                          </w:rPr>
+                          <w:t xml:space="preserve">gezockt</w:t>
+                        </w:r>
+                        <w:r>
+                          <w:rPr>
+                            <w:rFonts w:ascii="Cambria" w:cs="Cambria" w:eastAsia="Cambria" w:hAnsi="Cambria"/>
+                            <w:color w:val="000000"/>
+                            <w:sz w:val="19"/>
+                            <w:szCs w:val="19"/>
+                          </w:rPr>
+                          <w:t xml:space="preserve">.</w:t>
+                        </w:r>
+                      </w:p>
+                    </w:tc>
+                  </w:tr>
+                  <w:tr>
+                    <w:trPr>
+                      <w:cantSplit/>
+                    </w:trPr>
+                    <w:tc>
+                      <w:tcPr>
+                        <w:tcW w:type="dxa" w:w="3900"/>
+                        <w:tcBorders>
+                          <w:top w:val="none" w:color="FFFFFF" w:sz="0"/>
+                          <w:left w:val="none" w:color="FFFFFF" w:sz="0"/>
+                          <w:bottom w:val="none" w:color="FFFFFF" w:sz="0"/>
+                          <w:right w:val="none" w:color="FFFFFF" w:sz="0"/>
+                        </w:tcBorders>
+                        <w:tcMar>
+                          <w:top w:type="dxa" w:w="15"/>
+                          <w:left w:type="dxa" w:w="100"/>
+                          <w:bottom w:type="dxa" w:w="15"/>
+                          <w:right w:type="dxa" w:w="100"/>
+                        </w:tcMar>
+                        <w:vAlign w:val="center"/>
+                      </w:tcPr>
+                      <w:p>
+                        <w:pPr>
+                          <w:spacing w:after="0" w:before="0"/>
+                        </w:pPr>
+                        <w:r>
+                          <w:rPr>
+                            <w:rFonts w:ascii="Cambria" w:cs="Cambria" w:eastAsia="Cambria" w:hAnsi="Cambria"/>
+                            <w:color w:val="000000"/>
+                            <w:sz w:val="19"/>
+                            <w:szCs w:val="19"/>
+                          </w:rPr>
+                          <w:t xml:space="preserve">Wir </w:t>
+                        </w:r>
+                        <w:r>
+                          <w:rPr>
+                            <w:rFonts w:ascii="Cambria" w:cs="Cambria" w:eastAsia="Cambria" w:hAnsi="Cambria"/>
+                            <w:b/>
+                            <w:bCs/>
+                            <w:color w:val="D9534F"/>
+                            <w:sz w:val="19"/>
+                            <w:szCs w:val="19"/>
+                          </w:rPr>
+                          <w:t xml:space="preserve">werden</w:t>
+                        </w:r>
+                        <w:r>
+                          <w:rPr>
+                            <w:rFonts w:ascii="Cambria" w:cs="Cambria" w:eastAsia="Cambria" w:hAnsi="Cambria"/>
+                            <w:color w:val="000000"/>
+                            <w:sz w:val="19"/>
+                            <w:szCs w:val="19"/>
+                          </w:rPr>
+                          <w:t xml:space="preserve"> ins Kino </w:t>
+                        </w:r>
+                        <w:r>
+                          <w:rPr>
+                            <w:rFonts w:ascii="Cambria" w:cs="Cambria" w:eastAsia="Cambria" w:hAnsi="Cambria"/>
+                            <w:b/>
+                            <w:bCs/>
+                            <w:color w:val="3F7CC4"/>
+                            <w:sz w:val="19"/>
+                            <w:szCs w:val="19"/>
+                          </w:rPr>
+                          <w:t xml:space="preserve">gehen</w:t>
+                        </w:r>
+                        <w:r>
+                          <w:rPr>
+                            <w:rFonts w:ascii="Cambria" w:cs="Cambria" w:eastAsia="Cambria" w:hAnsi="Cambria"/>
+                            <w:color w:val="000000"/>
+                            <w:sz w:val="19"/>
+                            <w:szCs w:val="19"/>
+                          </w:rPr>
+                          <w:t xml:space="preserve">.</w:t>
+                        </w:r>
+                      </w:p>
+                    </w:tc>
+                    <w:tc>
+                      <w:tcPr>
+                        <w:tcW w:type="dxa" w:w="3900"/>
+                        <w:tcBorders>
+                          <w:top w:val="none" w:color="FFFFFF" w:sz="0"/>
+                          <w:left w:val="none" w:color="FFFFFF" w:sz="0"/>
+                          <w:bottom w:val="none" w:color="FFFFFF" w:sz="0"/>
+                          <w:right w:val="none" w:color="FFFFFF" w:sz="0"/>
+                        </w:tcBorders>
+                        <w:tcMar>
+                          <w:top w:type="dxa" w:w="15"/>
+                          <w:left w:type="dxa" w:w="100"/>
+                          <w:bottom w:type="dxa" w:w="15"/>
+                          <w:right w:type="dxa" w:w="100"/>
+                        </w:tcMar>
+                        <w:vAlign w:val="center"/>
+                      </w:tcPr>
+                      <w:p>
+                        <w:pPr>
+                          <w:spacing w:after="0" w:before="0"/>
+                        </w:pPr>
+                        <w:r>
+                          <w:rPr>
+                            <w:rFonts w:ascii="Cambria" w:cs="Cambria" w:eastAsia="Cambria" w:hAnsi="Cambria"/>
+                            <w:color w:val="000000"/>
+                            <w:sz w:val="19"/>
+                            <w:szCs w:val="19"/>
+                          </w:rPr>
+                          <w:t xml:space="preserve">Wir </w:t>
+                        </w:r>
+                        <w:r>
+                          <w:rPr>
+                            <w:rFonts w:ascii="Cambria" w:cs="Cambria" w:eastAsia="Cambria" w:hAnsi="Cambria"/>
+                            <w:b/>
+                            <w:bCs/>
+                            <w:color w:val="D9534F"/>
+                            <w:sz w:val="19"/>
+                            <w:szCs w:val="19"/>
+                          </w:rPr>
+                          <w:t xml:space="preserve">sind</w:t>
+                        </w:r>
+                        <w:r>
+                          <w:rPr>
+                            <w:rFonts w:ascii="Cambria" w:cs="Cambria" w:eastAsia="Cambria" w:hAnsi="Cambria"/>
+                            <w:color w:val="000000"/>
+                            <w:sz w:val="19"/>
+                            <w:szCs w:val="19"/>
+                          </w:rPr>
+                          <w:t xml:space="preserve"> ins Kino </w:t>
+                        </w:r>
+                        <w:r>
+                          <w:rPr>
+                            <w:rFonts w:ascii="Cambria" w:cs="Cambria" w:eastAsia="Cambria" w:hAnsi="Cambria"/>
+                            <w:b/>
+                            <w:bCs/>
+                            <w:color w:val="C98A1E"/>
+                            <w:sz w:val="19"/>
+                            <w:szCs w:val="19"/>
+                          </w:rPr>
+                          <w:t xml:space="preserve">gegangen</w:t>
+                        </w:r>
+                        <w:r>
+                          <w:rPr>
+                            <w:rFonts w:ascii="Cambria" w:cs="Cambria" w:eastAsia="Cambria" w:hAnsi="Cambria"/>
+                            <w:color w:val="000000"/>
+                            <w:sz w:val="19"/>
+                            <w:szCs w:val="19"/>
+                          </w:rPr>
+                          <w:t xml:space="preserve">.</w:t>
+                        </w:r>
+                      </w:p>
+                    </w:tc>
+                  </w:tr>
+                  <w:tr>
+                    <w:trPr>
+                      <w:cantSplit/>
+                    </w:trPr>
+                    <w:tc>
+                      <w:tcPr>
+                        <w:tcW w:type="dxa" w:w="3900"/>
+                        <w:tcBorders>
+                          <w:top w:val="none" w:color="FFFFFF" w:sz="0"/>
+                          <w:left w:val="none" w:color="FFFFFF" w:sz="0"/>
+                          <w:bottom w:val="none" w:color="FFFFFF" w:sz="0"/>
+                          <w:right w:val="none" w:color="FFFFFF" w:sz="0"/>
+                        </w:tcBorders>
+                        <w:tcMar>
+                          <w:top w:type="dxa" w:w="15"/>
+                          <w:left w:type="dxa" w:w="100"/>
+                          <w:bottom w:type="dxa" w:w="15"/>
+                          <w:right w:type="dxa" w:w="100"/>
+                        </w:tcMar>
+                        <w:vAlign w:val="center"/>
+                      </w:tcPr>
+                      <w:p>
+                        <w:pPr>
+                          <w:spacing w:after="0" w:before="0"/>
+                        </w:pPr>
+                        <w:r>
+                          <w:rPr>
+                            <w:rFonts w:ascii="Cambria" w:cs="Cambria" w:eastAsia="Cambria" w:hAnsi="Cambria"/>
+                            <w:color w:val="000000"/>
+                            <w:sz w:val="19"/>
+                            <w:szCs w:val="19"/>
+                          </w:rPr>
+                          <w:t xml:space="preserve">Mein Bruder </w:t>
+                        </w:r>
+                        <w:r>
+                          <w:rPr>
+                            <w:rFonts w:ascii="Cambria" w:cs="Cambria" w:eastAsia="Cambria" w:hAnsi="Cambria"/>
+                            <w:b/>
+                            <w:bCs/>
+                            <w:color w:val="D9534F"/>
+                            <w:sz w:val="19"/>
+                            <w:szCs w:val="19"/>
+                          </w:rPr>
+                          <w:t xml:space="preserve">wird</w:t>
+                        </w:r>
+                        <w:r>
+                          <w:rPr>
+                            <w:rFonts w:ascii="Cambria" w:cs="Cambria" w:eastAsia="Cambria" w:hAnsi="Cambria"/>
+                            <w:color w:val="000000"/>
+                            <w:sz w:val="19"/>
+                            <w:szCs w:val="19"/>
+                          </w:rPr>
+                          <w:t xml:space="preserve"> Fußball </w:t>
+                        </w:r>
+                        <w:r>
+                          <w:rPr>
+                            <w:rFonts w:ascii="Cambria" w:cs="Cambria" w:eastAsia="Cambria" w:hAnsi="Cambria"/>
+                            <w:b/>
+                            <w:bCs/>
+                            <w:color w:val="3F7CC4"/>
+                            <w:sz w:val="19"/>
+                            <w:szCs w:val="19"/>
+                          </w:rPr>
+                          <w:t xml:space="preserve">spielen</w:t>
+                        </w:r>
+                        <w:r>
+                          <w:rPr>
+                            <w:rFonts w:ascii="Cambria" w:cs="Cambria" w:eastAsia="Cambria" w:hAnsi="Cambria"/>
+                            <w:color w:val="000000"/>
+                            <w:sz w:val="19"/>
+                            <w:szCs w:val="19"/>
+                          </w:rPr>
+                          <w:t xml:space="preserve">.</w:t>
+                        </w:r>
+                      </w:p>
+                    </w:tc>
+                    <w:tc>
+                      <w:tcPr>
+                        <w:tcW w:type="dxa" w:w="3900"/>
+                        <w:tcBorders>
+                          <w:top w:val="none" w:color="FFFFFF" w:sz="0"/>
+                          <w:left w:val="none" w:color="FFFFFF" w:sz="0"/>
+                          <w:bottom w:val="none" w:color="FFFFFF" w:sz="0"/>
+                          <w:right w:val="none" w:color="FFFFFF" w:sz="0"/>
+                        </w:tcBorders>
+                        <w:tcMar>
+                          <w:top w:type="dxa" w:w="15"/>
+                          <w:left w:type="dxa" w:w="100"/>
+                          <w:bottom w:type="dxa" w:w="15"/>
+                          <w:right w:type="dxa" w:w="100"/>
+                        </w:tcMar>
+                        <w:vAlign w:val="center"/>
+                      </w:tcPr>
+                      <w:p>
+                        <w:pPr>
+                          <w:spacing w:after="0" w:before="0"/>
+                        </w:pPr>
+                        <w:r>
+                          <w:rPr>
+                            <w:rFonts w:ascii="Cambria" w:cs="Cambria" w:eastAsia="Cambria" w:hAnsi="Cambria"/>
+                            <w:color w:val="000000"/>
+                            <w:sz w:val="19"/>
+                            <w:szCs w:val="19"/>
+                          </w:rPr>
+                          <w:t xml:space="preserve">Mein Bruder </w:t>
+                        </w:r>
+                        <w:r>
+                          <w:rPr>
+                            <w:rFonts w:ascii="Cambria" w:cs="Cambria" w:eastAsia="Cambria" w:hAnsi="Cambria"/>
+                            <w:b/>
+                            <w:bCs/>
+                            <w:color w:val="D9534F"/>
+                            <w:sz w:val="19"/>
+                            <w:szCs w:val="19"/>
+                          </w:rPr>
+                          <w:t xml:space="preserve">hat</w:t>
+                        </w:r>
+                        <w:r>
+                          <w:rPr>
+                            <w:rFonts w:ascii="Cambria" w:cs="Cambria" w:eastAsia="Cambria" w:hAnsi="Cambria"/>
+                            <w:color w:val="000000"/>
+                            <w:sz w:val="19"/>
+                            <w:szCs w:val="19"/>
+                          </w:rPr>
+                          <w:t xml:space="preserve"> Fußball </w:t>
+                        </w:r>
+                        <w:r>
+                          <w:rPr>
+                            <w:rFonts w:ascii="Cambria" w:cs="Cambria" w:eastAsia="Cambria" w:hAnsi="Cambria"/>
+                            <w:b/>
+                            <w:bCs/>
+                            <w:color w:val="C98A1E"/>
+                            <w:sz w:val="19"/>
+                            <w:szCs w:val="19"/>
+                          </w:rPr>
+                          <w:t xml:space="preserve">gespielt</w:t>
+                        </w:r>
+                        <w:r>
+                          <w:rPr>
+                            <w:rFonts w:ascii="Cambria" w:cs="Cambria" w:eastAsia="Cambria" w:hAnsi="Cambria"/>
+                            <w:color w:val="000000"/>
+                            <w:sz w:val="19"/>
+                            <w:szCs w:val="19"/>
+                          </w:rPr>
+                          <w:t xml:space="preserve">.</w:t>
+                        </w:r>
+                      </w:p>
+                    </w:tc>
+                  </w:tr>
+                  <w:tr>
+                    <w:trPr>
+                      <w:cantSplit/>
+                    </w:trPr>
+                    <w:tc>
+                      <w:tcPr>
+                        <w:tcW w:type="dxa" w:w="3900"/>
+                        <w:tcBorders>
+                          <w:top w:val="none" w:color="FFFFFF" w:sz="0"/>
+                          <w:left w:val="none" w:color="FFFFFF" w:sz="0"/>
+                          <w:bottom w:val="none" w:color="FFFFFF" w:sz="0"/>
+                          <w:right w:val="none" w:color="FFFFFF" w:sz="0"/>
+                        </w:tcBorders>
+                        <w:tcMar>
+                          <w:top w:type="dxa" w:w="15"/>
+                          <w:left w:type="dxa" w:w="100"/>
+                          <w:bottom w:type="dxa" w:w="15"/>
+                          <w:right w:type="dxa" w:w="100"/>
+                        </w:tcMar>
+                        <w:vAlign w:val="center"/>
+                      </w:tcPr>
+                      <w:p>
+                        <w:pPr>
+                          <w:spacing w:after="0" w:before="0"/>
+                        </w:pPr>
+                        <w:r>
+                          <w:rPr>
+                            <w:rFonts w:ascii="Cambria" w:cs="Cambria" w:eastAsia="Cambria" w:hAnsi="Cambria"/>
+                            <w:color w:val="000000"/>
+                            <w:sz w:val="19"/>
+                            <w:szCs w:val="19"/>
+                          </w:rPr>
+                          <w:t xml:space="preserve">Am Sonntag </w:t>
+                        </w:r>
+                        <w:r>
+                          <w:rPr>
+                            <w:rFonts w:ascii="Cambria" w:cs="Cambria" w:eastAsia="Cambria" w:hAnsi="Cambria"/>
+                            <w:b/>
+                            <w:bCs/>
+                            <w:color w:val="D9534F"/>
+                            <w:sz w:val="19"/>
+                            <w:szCs w:val="19"/>
+                          </w:rPr>
+                          <w:t xml:space="preserve">werde</w:t>
+                        </w:r>
+                        <w:r>
+                          <w:rPr>
+                            <w:rFonts w:ascii="Cambria" w:cs="Cambria" w:eastAsia="Cambria" w:hAnsi="Cambria"/>
+                            <w:color w:val="000000"/>
+                            <w:sz w:val="19"/>
+                            <w:szCs w:val="19"/>
+                          </w:rPr>
+                          <w:t xml:space="preserve"> ich zu Oma </w:t>
+                        </w:r>
+                        <w:r>
+                          <w:rPr>
+                            <w:rFonts w:ascii="Cambria" w:cs="Cambria" w:eastAsia="Cambria" w:hAnsi="Cambria"/>
+                            <w:b/>
+                            <w:bCs/>
+                            <w:color w:val="3F7CC4"/>
+                            <w:sz w:val="19"/>
+                            <w:szCs w:val="19"/>
+                          </w:rPr>
+                          <w:t xml:space="preserve">fahren</w:t>
+                        </w:r>
+                        <w:r>
+                          <w:rPr>
+                            <w:rFonts w:ascii="Cambria" w:cs="Cambria" w:eastAsia="Cambria" w:hAnsi="Cambria"/>
+                            <w:color w:val="000000"/>
+                            <w:sz w:val="19"/>
+                            <w:szCs w:val="19"/>
+                          </w:rPr>
+                          <w:t xml:space="preserve">.</w:t>
+                        </w:r>
+                      </w:p>
+                    </w:tc>
+                    <w:tc>
+                      <w:tcPr>
+                        <w:tcW w:type="dxa" w:w="3900"/>
+                        <w:tcBorders>
+                          <w:top w:val="none" w:color="FFFFFF" w:sz="0"/>
+                          <w:left w:val="none" w:color="FFFFFF" w:sz="0"/>
+                          <w:bottom w:val="none" w:color="FFFFFF" w:sz="0"/>
+                          <w:right w:val="none" w:color="FFFFFF" w:sz="0"/>
+                        </w:tcBorders>
+                        <w:tcMar>
+                          <w:top w:type="dxa" w:w="15"/>
+                          <w:left w:type="dxa" w:w="100"/>
+                          <w:bottom w:type="dxa" w:w="15"/>
+                          <w:right w:type="dxa" w:w="100"/>
+                        </w:tcMar>
+                        <w:vAlign w:val="center"/>
+                      </w:tcPr>
+                      <w:p>
+                        <w:pPr>
+                          <w:spacing w:after="0" w:before="0"/>
+                        </w:pPr>
+                        <w:r>
+                          <w:rPr>
+                            <w:rFonts w:ascii="Cambria" w:cs="Cambria" w:eastAsia="Cambria" w:hAnsi="Cambria"/>
+                            <w:color w:val="000000"/>
+                            <w:sz w:val="19"/>
+                            <w:szCs w:val="19"/>
+                          </w:rPr>
+                          <w:t xml:space="preserve">Am Sonntag </w:t>
+                        </w:r>
+                        <w:r>
+                          <w:rPr>
+                            <w:rFonts w:ascii="Cambria" w:cs="Cambria" w:eastAsia="Cambria" w:hAnsi="Cambria"/>
+                            <w:b/>
+                            <w:bCs/>
+                            <w:color w:val="D9534F"/>
+                            <w:sz w:val="19"/>
+                            <w:szCs w:val="19"/>
+                          </w:rPr>
+                          <w:t xml:space="preserve">bin</w:t>
+                        </w:r>
+                        <w:r>
+                          <w:rPr>
+                            <w:rFonts w:ascii="Cambria" w:cs="Cambria" w:eastAsia="Cambria" w:hAnsi="Cambria"/>
+                            <w:color w:val="000000"/>
+                            <w:sz w:val="19"/>
+                            <w:szCs w:val="19"/>
+                          </w:rPr>
+                          <w:t xml:space="preserve"> ich zu Oma </w:t>
+                        </w:r>
+                        <w:r>
+                          <w:rPr>
+                            <w:rFonts w:ascii="Cambria" w:cs="Cambria" w:eastAsia="Cambria" w:hAnsi="Cambria"/>
+                            <w:b/>
+                            <w:bCs/>
+                            <w:color w:val="C98A1E"/>
+                            <w:sz w:val="19"/>
+                            <w:szCs w:val="19"/>
+                          </w:rPr>
+                          <w:t xml:space="preserve">gefahren</w:t>
+                        </w:r>
+                        <w:r>
+                          <w:rPr>
+                            <w:rFonts w:ascii="Cambria" w:cs="Cambria" w:eastAsia="Cambria" w:hAnsi="Cambria"/>
+                            <w:color w:val="000000"/>
+                            <w:sz w:val="19"/>
+                            <w:szCs w:val="19"/>
+                          </w:rPr>
+                          <w:t xml:space="preserve">.</w:t>
+                        </w:r>
+                      </w:p>
+                    </w:tc>
+                  </w:tr>
+                </w:tbl>
+                <w:p/>
               </w:tc>
             </w:tr>
           </w:tbl>
@@ -6017,7 +7356,295 @@
                 <w:sz w:val="19"/>
                 <w:szCs w:val="19"/>
               </w:rPr>
-              <w:t xml:space="preserve">1 gestern (habe + Partizip II, Perfekt) · 2 morgen (werde + Infinitiv, Futur I) · 3 gestern (sind + Partizip II, Perfekt) · 4 morgen (werden + Infinitiv, Futur I)</w:t>
+              <w:t xml:space="preserve">habe ausgeschlafen · habe gezockt · sind gegangen · hat gespielt · bin gefahren</w:t>
+            </w:r>
+          </w:p>
+        </w:tc>
+      </w:tr>
+    </w:tbl>
+    <w:p>
+      <w:pPr>
+        <w:spacing w:after="40" w:before="0"/>
+      </w:pPr>
+      <w:r>
+        <w:rPr>
+          <w:rFonts w:ascii="Calibri" w:cs="Calibri" w:eastAsia="Calibri" w:hAnsi="Calibri"/>
+          <w:color w:val="000000"/>
+          <w:sz w:val="22"/>
+          <w:szCs w:val="22"/>
+        </w:rPr>
+        <w:t xml:space="preserve"/>
+      </w:r>
+    </w:p>
+    <w:tbl>
+      <w:tblPr>
+        <w:tblW w:type="dxa" w:w="10206"/>
+        <w:tblBorders>
+          <w:top w:val="single" w:color="auto" w:sz="4"/>
+          <w:left w:val="single" w:color="auto" w:sz="4"/>
+          <w:bottom w:val="single" w:color="auto" w:sz="4"/>
+          <w:right w:val="single" w:color="auto" w:sz="4"/>
+          <w:insideH w:val="single" w:color="auto" w:sz="4"/>
+          <w:insideV w:val="single" w:color="auto" w:sz="4"/>
+        </w:tblBorders>
+      </w:tblPr>
+      <w:tblGrid>
+        <w:gridCol w:w="1700"/>
+        <w:gridCol w:w="8506"/>
+      </w:tblGrid>
+      <w:tr>
+        <w:trPr>
+          <w:cantSplit/>
+        </w:trPr>
+        <w:tc>
+          <w:tcPr>
+            <w:tcW w:type="dxa" w:w="1700"/>
+            <w:tcBorders>
+              <w:top w:val="single" w:color="D5DDEE" w:sz="6"/>
+              <w:left w:val="single" w:color="D5DDEE" w:sz="6"/>
+              <w:bottom w:val="single" w:color="D5DDEE" w:sz="6"/>
+              <w:right w:val="single" w:color="D5DDEE" w:sz="6"/>
+            </w:tcBorders>
+            <w:shd w:fill="F4F7FD" w:color="auto" w:val="clear"/>
+            <w:tcMar>
+              <w:top w:type="dxa" w:w="100"/>
+              <w:left w:type="dxa" w:w="100"/>
+              <w:bottom w:type="dxa" w:w="100"/>
+              <w:right w:type="dxa" w:w="100"/>
+            </w:tcMar>
+            <w:vAlign w:val="top"/>
+          </w:tcPr>
+          <w:p>
+            <w:pPr>
+              <w:spacing w:after="10" w:before="0"/>
+            </w:pPr>
+            <w:r>
+              <w:rPr>
+                <w:rFonts w:ascii="Calibri" w:cs="Calibri" w:eastAsia="Calibri" w:hAnsi="Calibri"/>
+                <w:color w:val="5B6B8C"/>
+                <w:sz w:val="16"/>
+                <w:szCs w:val="16"/>
+              </w:rPr>
+              <w:t xml:space="preserve">Klasse</w:t>
+            </w:r>
+          </w:p>
+          <w:p>
+            <w:pPr>
+              <w:spacing w:after="0" w:before="0"/>
+            </w:pPr>
+            <w:r>
+              <w:rPr>
+                <w:rFonts w:ascii="Calibri" w:cs="Calibri" w:eastAsia="Calibri" w:hAnsi="Calibri"/>
+                <w:b/>
+                <w:bCs/>
+                <w:color w:val="1E2761"/>
+                <w:sz w:val="20"/>
+                <w:szCs w:val="20"/>
+              </w:rPr>
+              <w:t xml:space="preserve">macht mündlich mit</w:t>
+            </w:r>
+          </w:p>
+        </w:tc>
+        <w:tc>
+          <w:tcPr>
+            <w:tcW w:type="dxa" w:w="8506"/>
+            <w:tcBorders>
+              <w:top w:val="single" w:color="D5DDEE" w:sz="6"/>
+              <w:left w:val="single" w:color="D5DDEE" w:sz="6"/>
+              <w:bottom w:val="single" w:color="D5DDEE" w:sz="6"/>
+              <w:right w:val="single" w:color="D5DDEE" w:sz="6"/>
+            </w:tcBorders>
+            <w:tcMar>
+              <w:top w:type="dxa" w:w="100"/>
+              <w:left w:type="dxa" w:w="160"/>
+              <w:bottom w:type="dxa" w:w="100"/>
+              <w:right w:type="dxa" w:w="100"/>
+            </w:tcMar>
+            <w:vAlign w:val="top"/>
+          </w:tcPr>
+          <w:p>
+            <w:pPr>
+              <w:spacing w:after="60" w:before="0"/>
+            </w:pPr>
+            <w:r>
+              <w:rPr>
+                <w:rFonts w:ascii="Calibri" w:cs="Calibri" w:eastAsia="Calibri" w:hAnsi="Calibri"/>
+                <w:b/>
+                <w:bCs/>
+                <w:color w:val="D9534F"/>
+                <w:sz w:val="20"/>
+                <w:szCs w:val="20"/>
+              </w:rPr>
+              <w:t xml:space="preserve">Ansage: </w:t>
+            </w:r>
+            <w:r>
+              <w:rPr>
+                <w:rFonts w:ascii="Calibri" w:cs="Calibri" w:eastAsia="Calibri" w:hAnsi="Calibri"/>
+                <w:i/>
+                <w:iCs/>
+                <w:color w:val="000000"/>
+                <w:sz w:val="21"/>
+                <w:szCs w:val="21"/>
+              </w:rPr>
+              <w:t xml:space="preserve">„Meldet euch. Vergleicht die beiden Spalten: Was ist gleich geblieben, was hat sich verändert?“</w:t>
+            </w:r>
+          </w:p>
+          <w:p>
+            <w:pPr>
+              <w:spacing w:after="50" w:before="0"/>
+            </w:pPr>
+            <w:r>
+              <w:rPr>
+                <w:rFonts w:ascii="Calibri" w:cs="Calibri" w:eastAsia="Calibri" w:hAnsi="Calibri"/>
+                <w:color w:val="000000"/>
+                <w:sz w:val="21"/>
+                <w:szCs w:val="21"/>
+              </w:rPr>
+              <w:t xml:space="preserve">Erkenntnis: Die Klammer ist geblieben – links ein Hilfsverb an Position 2, rechts der Partner am Satzende. Ausgetauscht wurden beide Teile: werde → habe/bin, Infinitiv → Partizip II.</w:t>
+            </w:r>
+          </w:p>
+          <w:p>
+            <w:pPr>
+              <w:spacing w:after="50" w:before="0"/>
+            </w:pPr>
+            <w:r>
+              <w:rPr>
+                <w:rFonts w:ascii="Calibri" w:cs="Calibri" w:eastAsia="Calibri" w:hAnsi="Calibri"/>
+                <w:color w:val="000000"/>
+                <w:sz w:val="21"/>
+                <w:szCs w:val="21"/>
+              </w:rPr>
+              <w:t xml:space="preserve">Merkhilfe für die Zeitform: „Schau auf beide Enden der Klammer: werde + Infinitiv = Futur I, habe/bin + Partizip II = Perfekt.“</w:t>
+            </w:r>
+          </w:p>
+        </w:tc>
+      </w:tr>
+    </w:tbl>
+    <w:p>
+      <w:pPr>
+        <w:spacing w:after="40" w:before="0"/>
+      </w:pPr>
+      <w:r>
+        <w:rPr>
+          <w:rFonts w:ascii="Calibri" w:cs="Calibri" w:eastAsia="Calibri" w:hAnsi="Calibri"/>
+          <w:color w:val="000000"/>
+          <w:sz w:val="22"/>
+          <w:szCs w:val="22"/>
+        </w:rPr>
+        <w:t xml:space="preserve"/>
+      </w:r>
+    </w:p>
+    <w:tbl>
+      <w:tblPr>
+        <w:tblW w:type="dxa" w:w="10206"/>
+        <w:tblBorders>
+          <w:top w:val="single" w:color="auto" w:sz="4"/>
+          <w:left w:val="single" w:color="auto" w:sz="4"/>
+          <w:bottom w:val="single" w:color="auto" w:sz="4"/>
+          <w:right w:val="single" w:color="auto" w:sz="4"/>
+          <w:insideH w:val="single" w:color="auto" w:sz="4"/>
+          <w:insideV w:val="single" w:color="auto" w:sz="4"/>
+        </w:tblBorders>
+      </w:tblPr>
+      <w:tblGrid>
+        <w:gridCol w:w="1700"/>
+        <w:gridCol w:w="8506"/>
+      </w:tblGrid>
+      <w:tr>
+        <w:trPr>
+          <w:cantSplit/>
+        </w:trPr>
+        <w:tc>
+          <w:tcPr>
+            <w:tcW w:type="dxa" w:w="1700"/>
+            <w:tcBorders>
+              <w:top w:val="single" w:color="D5DDEE" w:sz="6"/>
+              <w:left w:val="single" w:color="D5DDEE" w:sz="6"/>
+              <w:bottom w:val="single" w:color="D5DDEE" w:sz="6"/>
+              <w:right w:val="single" w:color="D5DDEE" w:sz="6"/>
+            </w:tcBorders>
+            <w:shd w:fill="F4F7FD" w:color="auto" w:val="clear"/>
+            <w:tcMar>
+              <w:top w:type="dxa" w:w="100"/>
+              <w:left w:type="dxa" w:w="100"/>
+              <w:bottom w:type="dxa" w:w="100"/>
+              <w:right w:type="dxa" w:w="100"/>
+            </w:tcMar>
+            <w:vAlign w:val="top"/>
+          </w:tcPr>
+          <w:p>
+            <w:pPr>
+              <w:spacing w:after="10" w:before="0"/>
+            </w:pPr>
+            <w:r>
+              <w:rPr>
+                <w:rFonts w:ascii="Calibri" w:cs="Calibri" w:eastAsia="Calibri" w:hAnsi="Calibri"/>
+                <w:color w:val="5B6B8C"/>
+                <w:sz w:val="16"/>
+                <w:szCs w:val="16"/>
+              </w:rPr>
+              <w:t xml:space="preserve">Klasse</w:t>
+            </w:r>
+          </w:p>
+          <w:p>
+            <w:pPr>
+              <w:spacing w:after="0" w:before="0"/>
+            </w:pPr>
+            <w:r>
+              <w:rPr>
+                <w:rFonts w:ascii="Calibri" w:cs="Calibri" w:eastAsia="Calibri" w:hAnsi="Calibri"/>
+                <w:b/>
+                <w:bCs/>
+                <w:color w:val="1E2761"/>
+                <w:sz w:val="20"/>
+                <w:szCs w:val="20"/>
+              </w:rPr>
+              <w:t xml:space="preserve">kontrolliert</w:t>
+            </w:r>
+          </w:p>
+        </w:tc>
+        <w:tc>
+          <w:tcPr>
+            <w:tcW w:type="dxa" w:w="8506"/>
+            <w:tcBorders>
+              <w:top w:val="single" w:color="D5DDEE" w:sz="6"/>
+              <w:left w:val="single" w:color="D5DDEE" w:sz="6"/>
+              <w:bottom w:val="single" w:color="D5DDEE" w:sz="6"/>
+              <w:right w:val="single" w:color="D5DDEE" w:sz="6"/>
+            </w:tcBorders>
+            <w:tcMar>
+              <w:top w:type="dxa" w:w="100"/>
+              <w:left w:type="dxa" w:w="160"/>
+              <w:bottom w:type="dxa" w:w="100"/>
+              <w:right w:type="dxa" w:w="100"/>
+            </w:tcMar>
+            <w:vAlign w:val="top"/>
+          </w:tcPr>
+          <w:p>
+            <w:pPr>
+              <w:spacing w:after="60" w:before="0"/>
+            </w:pPr>
+            <w:r>
+              <w:rPr>
+                <w:rFonts w:ascii="Calibri" w:cs="Calibri" w:eastAsia="Calibri" w:hAnsi="Calibri"/>
+                <w:b/>
+                <w:bCs/>
+                <w:color w:val="D9534F"/>
+                <w:sz w:val="20"/>
+                <w:szCs w:val="20"/>
+              </w:rPr>
+              <w:t xml:space="preserve">Ansage: </w:t>
+            </w:r>
+            <w:r>
+              <w:rPr>
+                <w:rFonts w:ascii="Calibri" w:cs="Calibri" w:eastAsia="Calibri" w:hAnsi="Calibri"/>
+                <w:i/>
+                <w:iCs/>
+                <w:color w:val="000000"/>
+                <w:sz w:val="21"/>
+                <w:szCs w:val="21"/>
+              </w:rPr>
+              <w:t xml:space="preserve">„Vergleicht eure rechte Spalte mit der Tafel und verbessert mit Grün.“</w:t>
             </w:r>
           </w:p>
         </w:tc>
@@ -6059,7 +7686,7 @@
           <w:sz w:val="21"/>
           <w:szCs w:val="21"/>
         </w:rPr>
-        <w:t xml:space="preserve">Noch offen aus der letzten Stunde: der eigene Merksatz zur Satzklammer und „Hilfsverb oder Vollverb“. Die Klammer hat die Klasse heute schon gezeichnet – der Merksatz dazu lässt sich in der nächsten Stunde direkt aus den Futur- und Perfekt-Sätzen ableiten.</w:t>
+        <w:t xml:space="preserve">Offen sind der Merksatz zur Satzklammer, das Perfekt als eigener Merksatz (haben oder sein: Bewegung, Veränderung) und „Hilfsverb oder Vollverb“. Die zwei Spalten von heute sind dafür die ideale Grundlage: Den Merksatz zur Satzklammer kann die Klasse in der nächsten Stunde direkt aus ihnen ableiten.</w:t>
       </w:r>
     </w:p>
     <w:sectPr>

</xml_diff>